<commit_message>
adding 5 lab physics
</commit_message>
<xml_diff>
--- a/physics/lab3/Фізика_ЛР-3_Цебринський_Назар_ІМ-44.docx
+++ b/physics/lab3/Фізика_ЛР-3_Цебринський_Назар_ІМ-44.docx
@@ -605,6 +605,122 @@
         <w:pStyle w:val="Normal"/>
         <w:spacing w:lineRule="auto" w:line="288" w:before="0" w:after="0"/>
         <w:ind w:firstLine="567"/>
+        <w:jc w:val="start"/>
+        <w:rPr>
+          <w:rFonts w:ascii="Times New Roman" w:hAnsi="Times New Roman" w:eastAsia="Times New Roman"/>
+          <w:sz w:val="28"/>
+          <w:szCs w:val="28"/>
+        </w:rPr>
+      </w:pPr>
+      <w:r>
+        <w:rPr>
+          <w:rFonts w:eastAsia="Times New Roman" w:ascii="Times New Roman" w:hAnsi="Times New Roman"/>
+          <w:b/>
+          <w:bCs/>
+          <w:i w:val="false"/>
+          <w:iCs w:val="false"/>
+          <w:sz w:val="28"/>
+          <w:szCs w:val="28"/>
+        </w:rPr>
+        <w:t>Мета роботи:</w:t>
+      </w:r>
+      <w:r>
+        <w:rPr>
+          <w:rFonts w:eastAsia="Times New Roman" w:ascii="Times New Roman" w:hAnsi="Times New Roman"/>
+          <w:sz w:val="28"/>
+          <w:szCs w:val="28"/>
+        </w:rPr>
+        <w:t xml:space="preserve"> експериментально вивчити гістерезис феромагнітних</w:t>
+      </w:r>
+    </w:p>
+    <w:p>
+      <w:pPr>
+        <w:pStyle w:val="Normal"/>
+        <w:spacing w:lineRule="auto" w:line="288" w:before="0" w:after="0"/>
+        <w:ind w:firstLine="567"/>
+        <w:jc w:val="start"/>
+        <w:rPr>
+          <w:rFonts w:ascii="Times New Roman" w:hAnsi="Times New Roman" w:eastAsia="Times New Roman"/>
+          <w:sz w:val="28"/>
+          <w:szCs w:val="28"/>
+        </w:rPr>
+      </w:pPr>
+      <w:r>
+        <w:rPr>
+          <w:rFonts w:eastAsia="Times New Roman" w:ascii="Times New Roman" w:hAnsi="Times New Roman"/>
+          <w:sz w:val="28"/>
+          <w:szCs w:val="28"/>
+        </w:rPr>
+        <w:t>матеріалів, розрахувати і побудувати основну криву намагнічування,</w:t>
+      </w:r>
+    </w:p>
+    <w:p>
+      <w:pPr>
+        <w:pStyle w:val="Normal"/>
+        <w:spacing w:lineRule="auto" w:line="288" w:before="0" w:after="0"/>
+        <w:ind w:firstLine="567"/>
+        <w:jc w:val="start"/>
+        <w:rPr>
+          <w:rFonts w:ascii="Times New Roman" w:hAnsi="Times New Roman" w:eastAsia="Times New Roman"/>
+          <w:sz w:val="28"/>
+          <w:szCs w:val="28"/>
+        </w:rPr>
+      </w:pPr>
+      <w:r>
+        <w:rPr>
+          <w:rFonts w:eastAsia="Times New Roman" w:ascii="Times New Roman" w:hAnsi="Times New Roman"/>
+          <w:sz w:val="28"/>
+          <w:szCs w:val="28"/>
+        </w:rPr>
+        <w:t>розрахувати роботу перемагнічування і коерцитивну силу, а також</w:t>
+      </w:r>
+    </w:p>
+    <w:p>
+      <w:pPr>
+        <w:pStyle w:val="Normal"/>
+        <w:spacing w:lineRule="auto" w:line="288" w:before="0" w:after="0"/>
+        <w:ind w:firstLine="567"/>
+        <w:jc w:val="start"/>
+        <w:rPr>
+          <w:rFonts w:ascii="Times New Roman" w:hAnsi="Times New Roman" w:eastAsia="Times New Roman"/>
+          <w:sz w:val="28"/>
+          <w:szCs w:val="28"/>
+        </w:rPr>
+      </w:pPr>
+      <w:r>
+        <w:rPr>
+          <w:rFonts w:eastAsia="Times New Roman" w:ascii="Times New Roman" w:hAnsi="Times New Roman"/>
+          <w:sz w:val="28"/>
+          <w:szCs w:val="28"/>
+        </w:rPr>
+        <w:t>ознайомитись з розрахунком похибки величин, що вимірювались.</w:t>
+      </w:r>
+    </w:p>
+    <w:p>
+      <w:pPr>
+        <w:pStyle w:val="Normal"/>
+        <w:spacing w:lineRule="auto" w:line="288" w:before="0" w:after="0"/>
+        <w:ind w:firstLine="567"/>
+        <w:jc w:val="center"/>
+        <w:rPr>
+          <w:rFonts w:ascii="Times New Roman" w:hAnsi="Times New Roman" w:eastAsia="Times New Roman"/>
+          <w:sz w:val="28"/>
+          <w:szCs w:val="28"/>
+        </w:rPr>
+      </w:pPr>
+      <w:r>
+        <w:rPr>
+          <w:rFonts w:eastAsia="Times New Roman" w:ascii="Times New Roman" w:hAnsi="Times New Roman"/>
+          <w:sz w:val="28"/>
+          <w:szCs w:val="28"/>
+        </w:rPr>
+      </w:r>
+    </w:p>
+    <w:p>
+      <w:pPr>
+        <w:pStyle w:val="Normal"/>
+        <w:spacing w:lineRule="auto" w:line="288" w:before="0" w:after="0"/>
+        <w:ind w:firstLine="567"/>
         <w:jc w:val="center"/>
         <w:rPr>
           <w:rFonts w:ascii="Times New Roman" w:hAnsi="Times New Roman" w:eastAsia="Times New Roman"/>
@@ -739,7 +855,7 @@
           <w:lang w:eastAsia="ru-RU"/>
         </w:rPr>
         <w:drawing>
-          <wp:anchor distT="0" distB="0" distL="0" distR="0" simplePos="0" relativeHeight="2" behindDoc="0" locked="0" layoutInCell="0" allowOverlap="1">
+          <wp:anchor distT="0" distB="0" distL="0" distR="0" simplePos="0" relativeHeight="3" behindDoc="0" locked="0" layoutInCell="0" allowOverlap="1">
             <wp:simplePos x="0" y="0"/>
             <wp:positionH relativeFrom="column">
               <wp:align>center</wp:align>
@@ -883,7 +999,7 @@
           <w:lang w:eastAsia="ru-RU"/>
         </w:rPr>
         <w:drawing>
-          <wp:anchor distT="0" distB="0" distL="0" distR="0" simplePos="0" relativeHeight="3" behindDoc="0" locked="0" layoutInCell="0" allowOverlap="1">
+          <wp:anchor distT="0" distB="0" distL="0" distR="0" simplePos="0" relativeHeight="4" behindDoc="0" locked="0" layoutInCell="0" allowOverlap="1">
             <wp:simplePos x="0" y="0"/>
             <wp:positionH relativeFrom="column">
               <wp:align>center</wp:align>
@@ -1246,96 +1362,1745 @@
     </w:p>
     <w:p>
       <w:pPr>
-        <w:pStyle w:val="Normal"/>
-        <w:spacing w:lineRule="auto" w:line="288" w:before="0" w:after="0"/>
-        <w:jc w:val="center"/>
-        <w:rPr>
-          <w:rFonts w:ascii="Times New Roman" w:hAnsi="Times New Roman" w:eastAsia="Times New Roman"/>
-          <w:iCs/>
-          <w:color w:val="000000"/>
-          <w:sz w:val="28"/>
-          <w:szCs w:val="28"/>
-          <w:lang w:eastAsia="ru-RU"/>
-        </w:rPr>
-      </w:pPr>
-      <w:r>
-        <w:rPr>
-          <w:rFonts w:eastAsia="Times New Roman" w:ascii="Times New Roman" w:hAnsi="Times New Roman"/>
-          <w:iCs/>
-          <w:color w:val="000000"/>
-          <w:sz w:val="28"/>
-          <w:szCs w:val="28"/>
-          <w:lang w:eastAsia="ru-RU"/>
-        </w:rPr>
-      </w:r>
-    </w:p>
-    <w:p>
-      <w:pPr>
-        <w:pStyle w:val="Normal"/>
-        <w:spacing w:lineRule="auto" w:line="288" w:before="0" w:after="0"/>
-        <w:jc w:val="center"/>
-        <w:rPr>
-          <w:rFonts w:ascii="Times New Roman" w:hAnsi="Times New Roman" w:eastAsia="Times New Roman"/>
-          <w:iCs/>
-          <w:color w:val="000000"/>
-          <w:sz w:val="28"/>
-          <w:szCs w:val="28"/>
-          <w:lang w:eastAsia="ru-RU"/>
-        </w:rPr>
-      </w:pPr>
-      <w:r>
-        <w:rPr>
-          <w:rFonts w:eastAsia="Times New Roman" w:ascii="Times New Roman" w:hAnsi="Times New Roman"/>
-          <w:iCs/>
-          <w:color w:val="000000"/>
-          <w:sz w:val="28"/>
-          <w:szCs w:val="28"/>
-          <w:lang w:eastAsia="ru-RU"/>
-        </w:rPr>
-      </w:r>
-    </w:p>
-    <w:p>
-      <w:pPr>
-        <w:pStyle w:val="Normal"/>
-        <w:spacing w:lineRule="auto" w:line="288" w:before="0" w:after="0"/>
-        <w:jc w:val="center"/>
-        <w:rPr>
-          <w:rFonts w:ascii="Times New Roman" w:hAnsi="Times New Roman" w:eastAsia="Times New Roman"/>
-          <w:iCs/>
-          <w:color w:val="000000"/>
-          <w:sz w:val="28"/>
-          <w:szCs w:val="28"/>
-          <w:lang w:eastAsia="ru-RU"/>
-        </w:rPr>
-      </w:pPr>
-      <w:r>
-        <w:rPr>
-          <w:rFonts w:eastAsia="Times New Roman" w:ascii="Times New Roman" w:hAnsi="Times New Roman"/>
-          <w:iCs/>
-          <w:color w:val="000000"/>
-          <w:sz w:val="28"/>
-          <w:szCs w:val="28"/>
-          <w:lang w:eastAsia="ru-RU"/>
-        </w:rPr>
-      </w:r>
-    </w:p>
-    <w:p>
-      <w:pPr>
-        <w:pStyle w:val="Normal"/>
-        <w:spacing w:lineRule="auto" w:line="288" w:before="0" w:after="0"/>
-        <w:jc w:val="center"/>
-        <w:rPr>
-          <w:rFonts w:ascii="Times New Roman" w:hAnsi="Times New Roman" w:eastAsia="Times New Roman"/>
-          <w:iCs/>
-          <w:color w:val="000000"/>
-          <w:sz w:val="28"/>
-          <w:szCs w:val="28"/>
-          <w:lang w:eastAsia="ru-RU"/>
-        </w:rPr>
-      </w:pPr>
-      <w:r>
-        <w:rPr>
-          <w:rFonts w:eastAsia="Times New Roman" w:ascii="Times New Roman" w:hAnsi="Times New Roman"/>
+        <w:pStyle w:val="BodyText"/>
+        <w:spacing w:lineRule="auto" w:line="288" w:before="0" w:after="0"/>
+        <w:jc w:val="center"/>
+        <w:rPr>
+          <w:b/>
+          <w:bCs/>
+          <w:sz w:val="28"/>
+          <w:szCs w:val="28"/>
+        </w:rPr>
+      </w:pPr>
+      <w:r>
+        <w:rPr>
+          <w:b/>
+          <w:bCs/>
+          <w:sz w:val="28"/>
+          <w:szCs w:val="28"/>
+        </w:rPr>
+        <w:t>Порядок виконання роботи:</w:t>
+      </w:r>
+    </w:p>
+    <w:p>
+      <w:pPr>
+        <w:pStyle w:val="Normal"/>
+        <w:spacing w:lineRule="auto" w:line="288" w:before="0" w:after="0"/>
+        <w:jc w:val="center"/>
+        <w:rPr>
+          <w:rFonts w:ascii="Times New Roman" w:hAnsi="Times New Roman" w:eastAsia="Times New Roman"/>
+          <w:iCs/>
+          <w:color w:val="000000"/>
+          <w:sz w:val="28"/>
+          <w:szCs w:val="28"/>
+          <w:lang w:eastAsia="ru-RU"/>
+        </w:rPr>
+      </w:pPr>
+      <w:r>
+        <w:rPr>
+          <w:rFonts w:eastAsia="Times New Roman" w:ascii="Times New Roman" w:hAnsi="Times New Roman"/>
+          <w:iCs/>
+          <w:color w:val="000000"/>
+          <w:sz w:val="28"/>
+          <w:szCs w:val="28"/>
+          <w:lang w:eastAsia="ru-RU"/>
+        </w:rPr>
+        <w:drawing>
+          <wp:anchor distT="0" distB="0" distL="0" distR="0" simplePos="0" relativeHeight="5" behindDoc="0" locked="0" layoutInCell="0" allowOverlap="1">
+            <wp:simplePos x="0" y="0"/>
+            <wp:positionH relativeFrom="column">
+              <wp:align>center</wp:align>
+            </wp:positionH>
+            <wp:positionV relativeFrom="paragraph">
+              <wp:posOffset>635</wp:posOffset>
+            </wp:positionV>
+            <wp:extent cx="4799965" cy="4333240"/>
+            <wp:effectExtent l="0" t="0" r="0" b="0"/>
+            <wp:wrapSquare wrapText="largest"/>
+            <wp:docPr id="3" name="Image3"/>
+            <wp:cNvGraphicFramePr>
+              <a:graphicFrameLocks xmlns:a="http://schemas.openxmlformats.org/drawingml/2006/main" noChangeAspect="1"/>
+            </wp:cNvGraphicFramePr>
+            <a:graphic xmlns:a="http://schemas.openxmlformats.org/drawingml/2006/main">
+              <a:graphicData uri="http://schemas.openxmlformats.org/drawingml/2006/picture">
+                <pic:pic xmlns:pic="http://schemas.openxmlformats.org/drawingml/2006/picture">
+                  <pic:nvPicPr>
+                    <pic:cNvPr id="3" name="Image3"/>
+                    <pic:cNvPicPr>
+                      <a:picLocks noChangeAspect="1" noChangeArrowheads="1"/>
+                    </pic:cNvPicPr>
+                  </pic:nvPicPr>
+                  <pic:blipFill>
+                    <a:blip r:embed="rId4"/>
+                    <a:stretch>
+                      <a:fillRect/>
+                    </a:stretch>
+                  </pic:blipFill>
+                  <pic:spPr bwMode="auto">
+                    <a:xfrm>
+                      <a:off x="0" y="0"/>
+                      <a:ext cx="4799965" cy="4333240"/>
+                    </a:xfrm>
+                    <a:prstGeom prst="rect">
+                      <a:avLst/>
+                    </a:prstGeom>
+                    <a:noFill/>
+                  </pic:spPr>
+                </pic:pic>
+              </a:graphicData>
+            </a:graphic>
+          </wp:anchor>
+        </w:drawing>
+      </w:r>
+    </w:p>
+    <w:p>
+      <w:pPr>
+        <w:pStyle w:val="Normal"/>
+        <w:spacing w:lineRule="auto" w:line="288" w:before="0" w:after="0"/>
+        <w:jc w:val="center"/>
+        <w:rPr>
+          <w:rFonts w:ascii="Times New Roman" w:hAnsi="Times New Roman" w:eastAsia="Times New Roman"/>
+          <w:iCs/>
+          <w:color w:val="000000"/>
+          <w:sz w:val="28"/>
+          <w:szCs w:val="28"/>
+          <w:lang w:eastAsia="ru-RU"/>
+        </w:rPr>
+      </w:pPr>
+      <w:r>
+        <w:rPr>
+          <w:rFonts w:eastAsia="Times New Roman" w:ascii="Times New Roman" w:hAnsi="Times New Roman"/>
+          <w:iCs/>
+          <w:color w:val="000000"/>
+          <w:sz w:val="28"/>
+          <w:szCs w:val="28"/>
+          <w:lang w:eastAsia="ru-RU"/>
+        </w:rPr>
+      </w:r>
+    </w:p>
+    <w:p>
+      <w:pPr>
+        <w:pStyle w:val="Normal"/>
+        <w:spacing w:lineRule="auto" w:line="288" w:before="0" w:after="0"/>
+        <w:jc w:val="center"/>
+        <w:rPr>
+          <w:rFonts w:ascii="Times New Roman" w:hAnsi="Times New Roman" w:eastAsia="Times New Roman"/>
+          <w:b/>
+          <w:bCs/>
+          <w:iCs/>
+          <w:color w:val="000000"/>
+          <w:sz w:val="28"/>
+          <w:szCs w:val="28"/>
+          <w:lang w:eastAsia="ru-RU"/>
+        </w:rPr>
+      </w:pPr>
+      <w:r>
+        <w:rPr>
+          <w:rFonts w:eastAsia="Times New Roman" w:ascii="Times New Roman" w:hAnsi="Times New Roman"/>
+          <w:b/>
+          <w:bCs/>
+          <w:iCs/>
+          <w:color w:val="000000"/>
+          <w:sz w:val="28"/>
+          <w:szCs w:val="28"/>
+          <w:lang w:eastAsia="ru-RU"/>
+        </w:rPr>
+      </w:r>
+    </w:p>
+    <w:p>
+      <w:pPr>
+        <w:pStyle w:val="Normal"/>
+        <w:spacing w:lineRule="auto" w:line="288" w:before="0" w:after="0"/>
+        <w:jc w:val="center"/>
+        <w:rPr>
+          <w:rFonts w:ascii="Times New Roman" w:hAnsi="Times New Roman" w:eastAsia="Times New Roman"/>
+          <w:b/>
+          <w:bCs/>
+          <w:iCs/>
+          <w:color w:val="000000"/>
+          <w:sz w:val="28"/>
+          <w:szCs w:val="28"/>
+          <w:lang w:eastAsia="ru-RU"/>
+        </w:rPr>
+      </w:pPr>
+      <w:r>
+        <w:rPr>
+          <w:rFonts w:eastAsia="Times New Roman" w:ascii="Times New Roman" w:hAnsi="Times New Roman"/>
+          <w:b/>
+          <w:bCs/>
+          <w:iCs/>
+          <w:color w:val="000000"/>
+          <w:sz w:val="28"/>
+          <w:szCs w:val="28"/>
+          <w:lang w:eastAsia="ru-RU"/>
+        </w:rPr>
+      </w:r>
+    </w:p>
+    <w:p>
+      <w:pPr>
+        <w:pStyle w:val="Normal"/>
+        <w:spacing w:lineRule="auto" w:line="288" w:before="0" w:after="0"/>
+        <w:jc w:val="center"/>
+        <w:rPr>
+          <w:rFonts w:ascii="Times New Roman" w:hAnsi="Times New Roman" w:eastAsia="Times New Roman"/>
+          <w:b/>
+          <w:bCs/>
+          <w:iCs/>
+          <w:color w:val="000000"/>
+          <w:sz w:val="28"/>
+          <w:szCs w:val="28"/>
+          <w:lang w:eastAsia="ru-RU"/>
+        </w:rPr>
+      </w:pPr>
+      <w:r>
+        <w:rPr>
+          <w:rFonts w:eastAsia="Times New Roman" w:ascii="Times New Roman" w:hAnsi="Times New Roman"/>
+          <w:b/>
+          <w:bCs/>
+          <w:iCs/>
+          <w:color w:val="000000"/>
+          <w:sz w:val="28"/>
+          <w:szCs w:val="28"/>
+          <w:lang w:eastAsia="ru-RU"/>
+        </w:rPr>
+        <w:t>\</w:t>
+      </w:r>
+    </w:p>
+    <w:p>
+      <w:pPr>
+        <w:pStyle w:val="Normal"/>
+        <w:spacing w:lineRule="auto" w:line="288" w:before="0" w:after="0"/>
+        <w:jc w:val="center"/>
+        <w:rPr>
+          <w:rFonts w:ascii="Times New Roman" w:hAnsi="Times New Roman" w:eastAsia="Times New Roman"/>
+          <w:b/>
+          <w:bCs/>
+          <w:iCs/>
+          <w:color w:val="000000"/>
+          <w:sz w:val="28"/>
+          <w:szCs w:val="28"/>
+          <w:lang w:eastAsia="ru-RU"/>
+        </w:rPr>
+      </w:pPr>
+      <w:r>
+        <w:rPr>
+          <w:rFonts w:eastAsia="Times New Roman" w:ascii="Times New Roman" w:hAnsi="Times New Roman"/>
+          <w:b/>
+          <w:bCs/>
+          <w:iCs/>
+          <w:color w:val="000000"/>
+          <w:sz w:val="28"/>
+          <w:szCs w:val="28"/>
+          <w:lang w:eastAsia="ru-RU"/>
+        </w:rPr>
+      </w:r>
+    </w:p>
+    <w:p>
+      <w:pPr>
+        <w:pStyle w:val="Normal"/>
+        <w:spacing w:lineRule="auto" w:line="288" w:before="0" w:after="0"/>
+        <w:jc w:val="center"/>
+        <w:rPr>
+          <w:rFonts w:ascii="Times New Roman" w:hAnsi="Times New Roman" w:eastAsia="Times New Roman"/>
+          <w:b/>
+          <w:bCs/>
+          <w:iCs/>
+          <w:color w:val="000000"/>
+          <w:sz w:val="28"/>
+          <w:szCs w:val="28"/>
+          <w:lang w:eastAsia="ru-RU"/>
+        </w:rPr>
+      </w:pPr>
+      <w:r>
+        <w:rPr>
+          <w:rFonts w:eastAsia="Times New Roman" w:ascii="Times New Roman" w:hAnsi="Times New Roman"/>
+          <w:b/>
+          <w:bCs/>
+          <w:iCs/>
+          <w:color w:val="000000"/>
+          <w:sz w:val="28"/>
+          <w:szCs w:val="28"/>
+          <w:lang w:eastAsia="ru-RU"/>
+        </w:rPr>
+      </w:r>
+    </w:p>
+    <w:p>
+      <w:pPr>
+        <w:pStyle w:val="Normal"/>
+        <w:spacing w:lineRule="auto" w:line="288" w:before="0" w:after="0"/>
+        <w:jc w:val="center"/>
+        <w:rPr>
+          <w:rFonts w:ascii="Times New Roman" w:hAnsi="Times New Roman" w:eastAsia="Times New Roman"/>
+          <w:b/>
+          <w:bCs/>
+          <w:iCs/>
+          <w:color w:val="000000"/>
+          <w:sz w:val="28"/>
+          <w:szCs w:val="28"/>
+          <w:lang w:eastAsia="ru-RU"/>
+        </w:rPr>
+      </w:pPr>
+      <w:r>
+        <w:rPr>
+          <w:rFonts w:eastAsia="Times New Roman" w:ascii="Times New Roman" w:hAnsi="Times New Roman"/>
+          <w:b/>
+          <w:bCs/>
+          <w:iCs/>
+          <w:color w:val="000000"/>
+          <w:sz w:val="28"/>
+          <w:szCs w:val="28"/>
+          <w:lang w:eastAsia="ru-RU"/>
+        </w:rPr>
+      </w:r>
+    </w:p>
+    <w:p>
+      <w:pPr>
+        <w:pStyle w:val="Normal"/>
+        <w:spacing w:lineRule="auto" w:line="288" w:before="0" w:after="0"/>
+        <w:jc w:val="center"/>
+        <w:rPr>
+          <w:rFonts w:ascii="Times New Roman" w:hAnsi="Times New Roman" w:eastAsia="Times New Roman"/>
+          <w:b/>
+          <w:bCs/>
+          <w:iCs/>
+          <w:color w:val="000000"/>
+          <w:sz w:val="28"/>
+          <w:szCs w:val="28"/>
+          <w:lang w:eastAsia="ru-RU"/>
+        </w:rPr>
+      </w:pPr>
+      <w:r>
+        <w:rPr>
+          <w:rFonts w:eastAsia="Times New Roman" w:ascii="Times New Roman" w:hAnsi="Times New Roman"/>
+          <w:b/>
+          <w:bCs/>
+          <w:iCs/>
+          <w:color w:val="000000"/>
+          <w:sz w:val="28"/>
+          <w:szCs w:val="28"/>
+          <w:lang w:eastAsia="ru-RU"/>
+        </w:rPr>
+      </w:r>
+    </w:p>
+    <w:p>
+      <w:pPr>
+        <w:pStyle w:val="Normal"/>
+        <w:spacing w:lineRule="auto" w:line="288" w:before="0" w:after="0"/>
+        <w:jc w:val="center"/>
+        <w:rPr>
+          <w:rFonts w:ascii="Times New Roman" w:hAnsi="Times New Roman" w:eastAsia="Times New Roman"/>
+          <w:b/>
+          <w:bCs/>
+          <w:iCs/>
+          <w:color w:val="000000"/>
+          <w:sz w:val="28"/>
+          <w:szCs w:val="28"/>
+          <w:lang w:eastAsia="ru-RU"/>
+        </w:rPr>
+      </w:pPr>
+      <w:r>
+        <w:rPr>
+          <w:rFonts w:eastAsia="Times New Roman" w:ascii="Times New Roman" w:hAnsi="Times New Roman"/>
+          <w:b/>
+          <w:bCs/>
+          <w:iCs/>
+          <w:color w:val="000000"/>
+          <w:sz w:val="28"/>
+          <w:szCs w:val="28"/>
+          <w:lang w:eastAsia="ru-RU"/>
+        </w:rPr>
+      </w:r>
+    </w:p>
+    <w:p>
+      <w:pPr>
+        <w:pStyle w:val="Normal"/>
+        <w:spacing w:lineRule="auto" w:line="288" w:before="0" w:after="0"/>
+        <w:jc w:val="center"/>
+        <w:rPr>
+          <w:rFonts w:ascii="Times New Roman" w:hAnsi="Times New Roman" w:eastAsia="Times New Roman"/>
+          <w:b/>
+          <w:bCs/>
+          <w:iCs/>
+          <w:color w:val="000000"/>
+          <w:sz w:val="28"/>
+          <w:szCs w:val="28"/>
+          <w:lang w:eastAsia="ru-RU"/>
+        </w:rPr>
+      </w:pPr>
+      <w:r>
+        <w:rPr>
+          <w:rFonts w:eastAsia="Times New Roman" w:ascii="Times New Roman" w:hAnsi="Times New Roman"/>
+          <w:b/>
+          <w:bCs/>
+          <w:iCs/>
+          <w:color w:val="000000"/>
+          <w:sz w:val="28"/>
+          <w:szCs w:val="28"/>
+          <w:lang w:eastAsia="ru-RU"/>
+        </w:rPr>
+      </w:r>
+    </w:p>
+    <w:p>
+      <w:pPr>
+        <w:pStyle w:val="Normal"/>
+        <w:spacing w:lineRule="auto" w:line="288" w:before="0" w:after="0"/>
+        <w:jc w:val="center"/>
+        <w:rPr>
+          <w:rFonts w:ascii="Times New Roman" w:hAnsi="Times New Roman" w:eastAsia="Times New Roman"/>
+          <w:b/>
+          <w:bCs/>
+          <w:iCs/>
+          <w:color w:val="000000"/>
+          <w:sz w:val="28"/>
+          <w:szCs w:val="28"/>
+          <w:lang w:eastAsia="ru-RU"/>
+        </w:rPr>
+      </w:pPr>
+      <w:r>
+        <w:rPr>
+          <w:rFonts w:eastAsia="Times New Roman" w:ascii="Times New Roman" w:hAnsi="Times New Roman"/>
+          <w:b/>
+          <w:bCs/>
+          <w:iCs/>
+          <w:color w:val="000000"/>
+          <w:sz w:val="28"/>
+          <w:szCs w:val="28"/>
+          <w:lang w:eastAsia="ru-RU"/>
+        </w:rPr>
+      </w:r>
+    </w:p>
+    <w:p>
+      <w:pPr>
+        <w:pStyle w:val="Normal"/>
+        <w:spacing w:lineRule="auto" w:line="288" w:before="0" w:after="0"/>
+        <w:jc w:val="center"/>
+        <w:rPr>
+          <w:rFonts w:ascii="Times New Roman" w:hAnsi="Times New Roman" w:eastAsia="Times New Roman"/>
+          <w:b/>
+          <w:bCs/>
+          <w:iCs/>
+          <w:color w:val="000000"/>
+          <w:sz w:val="28"/>
+          <w:szCs w:val="28"/>
+          <w:lang w:eastAsia="ru-RU"/>
+        </w:rPr>
+      </w:pPr>
+      <w:r>
+        <w:rPr>
+          <w:rFonts w:eastAsia="Times New Roman" w:ascii="Times New Roman" w:hAnsi="Times New Roman"/>
+          <w:b/>
+          <w:bCs/>
+          <w:iCs/>
+          <w:color w:val="000000"/>
+          <w:sz w:val="28"/>
+          <w:szCs w:val="28"/>
+          <w:lang w:eastAsia="ru-RU"/>
+        </w:rPr>
+      </w:r>
+    </w:p>
+    <w:p>
+      <w:pPr>
+        <w:pStyle w:val="Normal"/>
+        <w:spacing w:lineRule="auto" w:line="288" w:before="0" w:after="0"/>
+        <w:jc w:val="center"/>
+        <w:rPr>
+          <w:rFonts w:ascii="Times New Roman" w:hAnsi="Times New Roman" w:eastAsia="Times New Roman"/>
+          <w:b/>
+          <w:bCs/>
+          <w:iCs/>
+          <w:color w:val="000000"/>
+          <w:sz w:val="28"/>
+          <w:szCs w:val="28"/>
+          <w:lang w:eastAsia="ru-RU"/>
+        </w:rPr>
+      </w:pPr>
+      <w:r>
+        <w:rPr>
+          <w:rFonts w:eastAsia="Times New Roman" w:ascii="Times New Roman" w:hAnsi="Times New Roman"/>
+          <w:b/>
+          <w:bCs/>
+          <w:iCs/>
+          <w:color w:val="000000"/>
+          <w:sz w:val="28"/>
+          <w:szCs w:val="28"/>
+          <w:lang w:eastAsia="ru-RU"/>
+        </w:rPr>
+      </w:r>
+    </w:p>
+    <w:p>
+      <w:pPr>
+        <w:pStyle w:val="Normal"/>
+        <w:spacing w:lineRule="auto" w:line="288" w:before="0" w:after="0"/>
+        <w:jc w:val="center"/>
+        <w:rPr>
+          <w:rFonts w:ascii="Times New Roman" w:hAnsi="Times New Roman" w:eastAsia="Times New Roman"/>
+          <w:b/>
+          <w:bCs/>
+          <w:iCs/>
+          <w:color w:val="000000"/>
+          <w:sz w:val="28"/>
+          <w:szCs w:val="28"/>
+          <w:lang w:eastAsia="ru-RU"/>
+        </w:rPr>
+      </w:pPr>
+      <w:r>
+        <w:rPr>
+          <w:rFonts w:eastAsia="Times New Roman" w:ascii="Times New Roman" w:hAnsi="Times New Roman"/>
+          <w:b/>
+          <w:bCs/>
+          <w:iCs/>
+          <w:color w:val="000000"/>
+          <w:sz w:val="28"/>
+          <w:szCs w:val="28"/>
+          <w:lang w:eastAsia="ru-RU"/>
+        </w:rPr>
+      </w:r>
+    </w:p>
+    <w:p>
+      <w:pPr>
+        <w:pStyle w:val="Normal"/>
+        <w:spacing w:lineRule="auto" w:line="288" w:before="0" w:after="0"/>
+        <w:jc w:val="center"/>
+        <w:rPr>
+          <w:rFonts w:ascii="Times New Roman" w:hAnsi="Times New Roman" w:eastAsia="Times New Roman"/>
+          <w:b/>
+          <w:bCs/>
+          <w:iCs/>
+          <w:color w:val="000000"/>
+          <w:sz w:val="28"/>
+          <w:szCs w:val="28"/>
+          <w:lang w:eastAsia="ru-RU"/>
+        </w:rPr>
+      </w:pPr>
+      <w:r>
+        <w:rPr>
+          <w:rFonts w:eastAsia="Times New Roman" w:ascii="Times New Roman" w:hAnsi="Times New Roman"/>
+          <w:b/>
+          <w:bCs/>
+          <w:iCs/>
+          <w:color w:val="000000"/>
+          <w:sz w:val="28"/>
+          <w:szCs w:val="28"/>
+          <w:lang w:eastAsia="ru-RU"/>
+        </w:rPr>
+      </w:r>
+    </w:p>
+    <w:p>
+      <w:pPr>
+        <w:pStyle w:val="Normal"/>
+        <w:spacing w:lineRule="auto" w:line="288" w:before="0" w:after="0"/>
+        <w:jc w:val="center"/>
+        <w:rPr>
+          <w:rFonts w:ascii="Times New Roman" w:hAnsi="Times New Roman" w:eastAsia="Times New Roman"/>
+          <w:b/>
+          <w:bCs/>
+          <w:iCs/>
+          <w:color w:val="000000"/>
+          <w:sz w:val="28"/>
+          <w:szCs w:val="28"/>
+          <w:lang w:eastAsia="ru-RU"/>
+        </w:rPr>
+      </w:pPr>
+      <w:r>
+        <w:rPr>
+          <w:rFonts w:eastAsia="Times New Roman" w:ascii="Times New Roman" w:hAnsi="Times New Roman"/>
+          <w:b/>
+          <w:bCs/>
+          <w:iCs/>
+          <w:color w:val="000000"/>
+          <w:sz w:val="28"/>
+          <w:szCs w:val="28"/>
+          <w:lang w:eastAsia="ru-RU"/>
+        </w:rPr>
+      </w:r>
+    </w:p>
+    <w:p>
+      <w:pPr>
+        <w:pStyle w:val="Normal"/>
+        <w:spacing w:lineRule="auto" w:line="288" w:before="0" w:after="0"/>
+        <w:jc w:val="center"/>
+        <w:rPr>
+          <w:rFonts w:ascii="Times New Roman" w:hAnsi="Times New Roman" w:eastAsia="Times New Roman"/>
+          <w:b/>
+          <w:bCs/>
+          <w:iCs/>
+          <w:color w:val="000000"/>
+          <w:sz w:val="28"/>
+          <w:szCs w:val="28"/>
+          <w:lang w:eastAsia="ru-RU"/>
+        </w:rPr>
+      </w:pPr>
+      <w:r>
+        <w:rPr>
+          <w:rFonts w:eastAsia="Times New Roman" w:ascii="Times New Roman" w:hAnsi="Times New Roman"/>
+          <w:b/>
+          <w:bCs/>
+          <w:iCs/>
+          <w:color w:val="000000"/>
+          <w:sz w:val="28"/>
+          <w:szCs w:val="28"/>
+          <w:lang w:eastAsia="ru-RU"/>
+        </w:rPr>
+      </w:r>
+    </w:p>
+    <w:p>
+      <w:pPr>
+        <w:pStyle w:val="Normal"/>
+        <w:spacing w:lineRule="auto" w:line="288" w:before="0" w:after="0"/>
+        <w:jc w:val="center"/>
+        <w:rPr>
+          <w:rFonts w:ascii="Times New Roman" w:hAnsi="Times New Roman" w:eastAsia="Times New Roman"/>
+          <w:b/>
+          <w:bCs/>
+          <w:iCs/>
+          <w:color w:val="000000"/>
+          <w:sz w:val="28"/>
+          <w:szCs w:val="28"/>
+          <w:lang w:eastAsia="ru-RU"/>
+        </w:rPr>
+      </w:pPr>
+      <w:r>
+        <w:rPr>
+          <w:rFonts w:eastAsia="Times New Roman" w:ascii="Times New Roman" w:hAnsi="Times New Roman"/>
+          <w:b/>
+          <w:bCs/>
+          <w:iCs/>
+          <w:color w:val="000000"/>
+          <w:sz w:val="28"/>
+          <w:szCs w:val="28"/>
+          <w:lang w:eastAsia="ru-RU"/>
+        </w:rPr>
+      </w:r>
+    </w:p>
+    <w:p>
+      <w:pPr>
+        <w:pStyle w:val="Normal"/>
+        <w:spacing w:lineRule="auto" w:line="288" w:before="0" w:after="0"/>
+        <w:jc w:val="center"/>
+        <w:rPr>
+          <w:rFonts w:ascii="Times New Roman" w:hAnsi="Times New Roman" w:eastAsia="Times New Roman"/>
+          <w:b/>
+          <w:bCs/>
+          <w:iCs/>
+          <w:color w:val="000000"/>
+          <w:sz w:val="28"/>
+          <w:szCs w:val="28"/>
+          <w:lang w:eastAsia="ru-RU"/>
+        </w:rPr>
+      </w:pPr>
+      <w:r>
+        <w:rPr>
+          <w:rFonts w:eastAsia="Times New Roman" w:ascii="Times New Roman" w:hAnsi="Times New Roman"/>
+          <w:b/>
+          <w:bCs/>
+          <w:iCs/>
+          <w:color w:val="000000"/>
+          <w:sz w:val="28"/>
+          <w:szCs w:val="28"/>
+          <w:lang w:eastAsia="ru-RU"/>
+        </w:rPr>
+      </w:r>
+    </w:p>
+    <w:p>
+      <w:pPr>
+        <w:pStyle w:val="Normal"/>
+        <w:spacing w:lineRule="auto" w:line="288" w:before="0" w:after="0"/>
+        <w:jc w:val="center"/>
+        <w:rPr>
+          <w:rFonts w:ascii="Times New Roman" w:hAnsi="Times New Roman" w:eastAsia="Times New Roman"/>
+          <w:b/>
+          <w:bCs/>
+          <w:iCs/>
+          <w:color w:val="000000"/>
+          <w:sz w:val="28"/>
+          <w:szCs w:val="28"/>
+          <w:lang w:eastAsia="ru-RU"/>
+        </w:rPr>
+      </w:pPr>
+      <w:r>
+        <w:rPr>
+          <w:rFonts w:eastAsia="Times New Roman" w:ascii="Times New Roman" w:hAnsi="Times New Roman"/>
+          <w:b/>
+          <w:bCs/>
+          <w:iCs/>
+          <w:color w:val="000000"/>
+          <w:sz w:val="28"/>
+          <w:szCs w:val="28"/>
+          <w:lang w:eastAsia="ru-RU"/>
+        </w:rPr>
+      </w:r>
+    </w:p>
+    <w:p>
+      <w:pPr>
+        <w:pStyle w:val="Normal"/>
+        <w:spacing w:lineRule="auto" w:line="288" w:before="0" w:after="0"/>
+        <w:jc w:val="center"/>
+        <w:rPr>
+          <w:rFonts w:ascii="Times New Roman" w:hAnsi="Times New Roman" w:eastAsia="Times New Roman"/>
+          <w:b/>
+          <w:bCs/>
+          <w:iCs/>
+          <w:color w:val="000000"/>
+          <w:sz w:val="28"/>
+          <w:szCs w:val="28"/>
+          <w:lang w:eastAsia="ru-RU"/>
+        </w:rPr>
+      </w:pPr>
+      <w:r>
+        <w:rPr>
+          <w:rFonts w:eastAsia="Times New Roman" w:ascii="Times New Roman" w:hAnsi="Times New Roman"/>
+          <w:b/>
+          <w:bCs/>
+          <w:iCs/>
+          <w:color w:val="000000"/>
+          <w:sz w:val="28"/>
+          <w:szCs w:val="28"/>
+          <w:lang w:eastAsia="ru-RU"/>
+        </w:rPr>
+      </w:r>
+    </w:p>
+    <w:p>
+      <w:pPr>
+        <w:pStyle w:val="Normal"/>
+        <w:spacing w:lineRule="auto" w:line="288" w:before="0" w:after="0"/>
+        <w:jc w:val="center"/>
+        <w:rPr>
+          <w:rFonts w:ascii="Times New Roman" w:hAnsi="Times New Roman" w:eastAsia="Times New Roman"/>
+          <w:b/>
+          <w:bCs/>
+          <w:iCs/>
+          <w:color w:val="000000"/>
+          <w:sz w:val="28"/>
+          <w:szCs w:val="28"/>
+          <w:lang w:eastAsia="ru-RU"/>
+        </w:rPr>
+      </w:pPr>
+      <w:r>
+        <w:rPr>
+          <w:rFonts w:eastAsia="Times New Roman" w:ascii="Times New Roman" w:hAnsi="Times New Roman"/>
+          <w:b/>
+          <w:bCs/>
+          <w:iCs/>
+          <w:color w:val="000000"/>
+          <w:sz w:val="28"/>
+          <w:szCs w:val="28"/>
+          <w:lang w:eastAsia="ru-RU"/>
+        </w:rPr>
+      </w:r>
+    </w:p>
+    <w:p>
+      <w:pPr>
+        <w:pStyle w:val="Normal"/>
+        <w:spacing w:lineRule="auto" w:line="288" w:before="0" w:after="0"/>
+        <w:jc w:val="center"/>
+        <w:rPr>
+          <w:rFonts w:ascii="Times New Roman" w:hAnsi="Times New Roman" w:eastAsia="Times New Roman"/>
+          <w:b/>
+          <w:bCs/>
+          <w:iCs/>
+          <w:color w:val="000000"/>
+          <w:sz w:val="28"/>
+          <w:szCs w:val="28"/>
+          <w:lang w:eastAsia="ru-RU"/>
+        </w:rPr>
+      </w:pPr>
+      <w:r>
+        <w:rPr>
+          <w:rFonts w:eastAsia="Times New Roman" w:ascii="Times New Roman" w:hAnsi="Times New Roman"/>
+          <w:b/>
+          <w:bCs/>
+          <w:iCs/>
+          <w:color w:val="000000"/>
+          <w:sz w:val="28"/>
+          <w:szCs w:val="28"/>
+          <w:lang w:eastAsia="ru-RU"/>
+        </w:rPr>
+        <w:drawing>
+          <wp:anchor distT="0" distB="0" distL="0" distR="0" simplePos="0" relativeHeight="6" behindDoc="0" locked="0" layoutInCell="0" allowOverlap="1">
+            <wp:simplePos x="0" y="0"/>
+            <wp:positionH relativeFrom="column">
+              <wp:align>center</wp:align>
+            </wp:positionH>
+            <wp:positionV relativeFrom="paragraph">
+              <wp:posOffset>635</wp:posOffset>
+            </wp:positionV>
+            <wp:extent cx="4361815" cy="6790055"/>
+            <wp:effectExtent l="0" t="0" r="0" b="0"/>
+            <wp:wrapSquare wrapText="largest"/>
+            <wp:docPr id="4" name="Image4"/>
+            <wp:cNvGraphicFramePr>
+              <a:graphicFrameLocks xmlns:a="http://schemas.openxmlformats.org/drawingml/2006/main" noChangeAspect="1"/>
+            </wp:cNvGraphicFramePr>
+            <a:graphic xmlns:a="http://schemas.openxmlformats.org/drawingml/2006/main">
+              <a:graphicData uri="http://schemas.openxmlformats.org/drawingml/2006/picture">
+                <pic:pic xmlns:pic="http://schemas.openxmlformats.org/drawingml/2006/picture">
+                  <pic:nvPicPr>
+                    <pic:cNvPr id="4" name="Image4"/>
+                    <pic:cNvPicPr>
+                      <a:picLocks noChangeAspect="1" noChangeArrowheads="1"/>
+                    </pic:cNvPicPr>
+                  </pic:nvPicPr>
+                  <pic:blipFill>
+                    <a:blip r:embed="rId5"/>
+                    <a:stretch>
+                      <a:fillRect/>
+                    </a:stretch>
+                  </pic:blipFill>
+                  <pic:spPr bwMode="auto">
+                    <a:xfrm>
+                      <a:off x="0" y="0"/>
+                      <a:ext cx="4361815" cy="6790055"/>
+                    </a:xfrm>
+                    <a:prstGeom prst="rect">
+                      <a:avLst/>
+                    </a:prstGeom>
+                    <a:noFill/>
+                  </pic:spPr>
+                </pic:pic>
+              </a:graphicData>
+            </a:graphic>
+          </wp:anchor>
+        </w:drawing>
+      </w:r>
+    </w:p>
+    <w:p>
+      <w:pPr>
+        <w:pStyle w:val="Normal"/>
+        <w:spacing w:lineRule="auto" w:line="288" w:before="0" w:after="0"/>
+        <w:jc w:val="center"/>
+        <w:rPr>
+          <w:rFonts w:ascii="Times New Roman" w:hAnsi="Times New Roman" w:eastAsia="Times New Roman"/>
+          <w:b/>
+          <w:bCs/>
+          <w:iCs/>
+          <w:color w:val="000000"/>
+          <w:sz w:val="28"/>
+          <w:szCs w:val="28"/>
+          <w:lang w:eastAsia="ru-RU"/>
+        </w:rPr>
+      </w:pPr>
+      <w:r>
+        <w:rPr>
+          <w:rFonts w:eastAsia="Times New Roman" w:ascii="Times New Roman" w:hAnsi="Times New Roman"/>
+          <w:b/>
+          <w:bCs/>
+          <w:iCs/>
+          <w:color w:val="000000"/>
+          <w:sz w:val="28"/>
+          <w:szCs w:val="28"/>
+          <w:lang w:eastAsia="ru-RU"/>
+        </w:rPr>
+      </w:r>
+    </w:p>
+    <w:p>
+      <w:pPr>
+        <w:pStyle w:val="Normal"/>
+        <w:spacing w:lineRule="auto" w:line="288" w:before="0" w:after="0"/>
+        <w:jc w:val="center"/>
+        <w:rPr>
+          <w:rFonts w:ascii="Times New Roman" w:hAnsi="Times New Roman" w:eastAsia="Times New Roman"/>
+          <w:b/>
+          <w:bCs/>
+          <w:iCs/>
+          <w:color w:val="000000"/>
+          <w:sz w:val="28"/>
+          <w:szCs w:val="28"/>
+          <w:lang w:eastAsia="ru-RU"/>
+        </w:rPr>
+      </w:pPr>
+      <w:r>
+        <w:rPr>
+          <w:rFonts w:eastAsia="Times New Roman" w:ascii="Times New Roman" w:hAnsi="Times New Roman"/>
+          <w:b/>
+          <w:bCs/>
+          <w:iCs/>
+          <w:color w:val="000000"/>
+          <w:sz w:val="28"/>
+          <w:szCs w:val="28"/>
+          <w:lang w:eastAsia="ru-RU"/>
+        </w:rPr>
+      </w:r>
+    </w:p>
+    <w:p>
+      <w:pPr>
+        <w:pStyle w:val="Normal"/>
+        <w:spacing w:lineRule="auto" w:line="288" w:before="0" w:after="0"/>
+        <w:jc w:val="center"/>
+        <w:rPr>
+          <w:rFonts w:ascii="Times New Roman" w:hAnsi="Times New Roman" w:eastAsia="Times New Roman"/>
+          <w:b/>
+          <w:bCs/>
+          <w:iCs/>
+          <w:color w:val="000000"/>
+          <w:sz w:val="28"/>
+          <w:szCs w:val="28"/>
+          <w:lang w:eastAsia="ru-RU"/>
+        </w:rPr>
+      </w:pPr>
+      <w:r>
+        <w:rPr>
+          <w:rFonts w:eastAsia="Times New Roman" w:ascii="Times New Roman" w:hAnsi="Times New Roman"/>
+          <w:b/>
+          <w:bCs/>
+          <w:iCs/>
+          <w:color w:val="000000"/>
+          <w:sz w:val="28"/>
+          <w:szCs w:val="28"/>
+          <w:lang w:eastAsia="ru-RU"/>
+        </w:rPr>
+      </w:r>
+    </w:p>
+    <w:p>
+      <w:pPr>
+        <w:pStyle w:val="Normal"/>
+        <w:spacing w:lineRule="auto" w:line="288" w:before="0" w:after="0"/>
+        <w:jc w:val="center"/>
+        <w:rPr>
+          <w:rFonts w:ascii="Times New Roman" w:hAnsi="Times New Roman" w:eastAsia="Times New Roman"/>
+          <w:b/>
+          <w:bCs/>
+          <w:iCs/>
+          <w:color w:val="000000"/>
+          <w:sz w:val="28"/>
+          <w:szCs w:val="28"/>
+          <w:lang w:eastAsia="ru-RU"/>
+        </w:rPr>
+      </w:pPr>
+      <w:r>
+        <w:rPr>
+          <w:rFonts w:eastAsia="Times New Roman" w:ascii="Times New Roman" w:hAnsi="Times New Roman"/>
+          <w:b/>
+          <w:bCs/>
+          <w:iCs/>
+          <w:color w:val="000000"/>
+          <w:sz w:val="28"/>
+          <w:szCs w:val="28"/>
+          <w:lang w:eastAsia="ru-RU"/>
+        </w:rPr>
+      </w:r>
+    </w:p>
+    <w:p>
+      <w:pPr>
+        <w:pStyle w:val="Normal"/>
+        <w:spacing w:lineRule="auto" w:line="288" w:before="0" w:after="0"/>
+        <w:jc w:val="center"/>
+        <w:rPr>
+          <w:rFonts w:ascii="Times New Roman" w:hAnsi="Times New Roman" w:eastAsia="Times New Roman"/>
+          <w:b/>
+          <w:bCs/>
+          <w:iCs/>
+          <w:color w:val="000000"/>
+          <w:sz w:val="28"/>
+          <w:szCs w:val="28"/>
+          <w:lang w:eastAsia="ru-RU"/>
+        </w:rPr>
+      </w:pPr>
+      <w:r>
+        <w:rPr>
+          <w:rFonts w:eastAsia="Times New Roman" w:ascii="Times New Roman" w:hAnsi="Times New Roman"/>
+          <w:b/>
+          <w:bCs/>
+          <w:iCs/>
+          <w:color w:val="000000"/>
+          <w:sz w:val="28"/>
+          <w:szCs w:val="28"/>
+          <w:lang w:eastAsia="ru-RU"/>
+        </w:rPr>
+      </w:r>
+    </w:p>
+    <w:p>
+      <w:pPr>
+        <w:pStyle w:val="Normal"/>
+        <w:spacing w:lineRule="auto" w:line="288" w:before="0" w:after="0"/>
+        <w:jc w:val="center"/>
+        <w:rPr>
+          <w:rFonts w:ascii="Times New Roman" w:hAnsi="Times New Roman" w:eastAsia="Times New Roman"/>
+          <w:b/>
+          <w:bCs/>
+          <w:iCs/>
+          <w:color w:val="000000"/>
+          <w:sz w:val="28"/>
+          <w:szCs w:val="28"/>
+          <w:lang w:eastAsia="ru-RU"/>
+        </w:rPr>
+      </w:pPr>
+      <w:r>
+        <w:rPr>
+          <w:rFonts w:eastAsia="Times New Roman" w:ascii="Times New Roman" w:hAnsi="Times New Roman"/>
+          <w:b/>
+          <w:bCs/>
+          <w:iCs/>
+          <w:color w:val="000000"/>
+          <w:sz w:val="28"/>
+          <w:szCs w:val="28"/>
+          <w:lang w:eastAsia="ru-RU"/>
+        </w:rPr>
+      </w:r>
+    </w:p>
+    <w:p>
+      <w:pPr>
+        <w:pStyle w:val="Normal"/>
+        <w:spacing w:lineRule="auto" w:line="288" w:before="0" w:after="0"/>
+        <w:jc w:val="center"/>
+        <w:rPr>
+          <w:rFonts w:ascii="Times New Roman" w:hAnsi="Times New Roman" w:eastAsia="Times New Roman"/>
+          <w:b/>
+          <w:bCs/>
+          <w:iCs/>
+          <w:color w:val="000000"/>
+          <w:sz w:val="28"/>
+          <w:szCs w:val="28"/>
+          <w:lang w:eastAsia="ru-RU"/>
+        </w:rPr>
+      </w:pPr>
+      <w:r>
+        <w:rPr>
+          <w:rFonts w:eastAsia="Times New Roman" w:ascii="Times New Roman" w:hAnsi="Times New Roman"/>
+          <w:b/>
+          <w:bCs/>
+          <w:iCs/>
+          <w:color w:val="000000"/>
+          <w:sz w:val="28"/>
+          <w:szCs w:val="28"/>
+          <w:lang w:eastAsia="ru-RU"/>
+        </w:rPr>
+      </w:r>
+    </w:p>
+    <w:p>
+      <w:pPr>
+        <w:pStyle w:val="Normal"/>
+        <w:spacing w:lineRule="auto" w:line="288" w:before="0" w:after="0"/>
+        <w:jc w:val="center"/>
+        <w:rPr>
+          <w:rFonts w:ascii="Times New Roman" w:hAnsi="Times New Roman" w:eastAsia="Times New Roman"/>
+          <w:b/>
+          <w:bCs/>
+          <w:iCs/>
+          <w:color w:val="000000"/>
+          <w:sz w:val="28"/>
+          <w:szCs w:val="28"/>
+          <w:lang w:eastAsia="ru-RU"/>
+        </w:rPr>
+      </w:pPr>
+      <w:r>
+        <w:rPr>
+          <w:rFonts w:eastAsia="Times New Roman" w:ascii="Times New Roman" w:hAnsi="Times New Roman"/>
+          <w:b/>
+          <w:bCs/>
+          <w:iCs/>
+          <w:color w:val="000000"/>
+          <w:sz w:val="28"/>
+          <w:szCs w:val="28"/>
+          <w:lang w:eastAsia="ru-RU"/>
+        </w:rPr>
+      </w:r>
+    </w:p>
+    <w:p>
+      <w:pPr>
+        <w:pStyle w:val="Normal"/>
+        <w:spacing w:lineRule="auto" w:line="288" w:before="0" w:after="0"/>
+        <w:jc w:val="center"/>
+        <w:rPr>
+          <w:rFonts w:ascii="Times New Roman" w:hAnsi="Times New Roman" w:eastAsia="Times New Roman"/>
+          <w:b/>
+          <w:bCs/>
+          <w:iCs/>
+          <w:color w:val="000000"/>
+          <w:sz w:val="28"/>
+          <w:szCs w:val="28"/>
+          <w:lang w:eastAsia="ru-RU"/>
+        </w:rPr>
+      </w:pPr>
+      <w:r>
+        <w:rPr>
+          <w:rFonts w:eastAsia="Times New Roman" w:ascii="Times New Roman" w:hAnsi="Times New Roman"/>
+          <w:b/>
+          <w:bCs/>
+          <w:iCs/>
+          <w:color w:val="000000"/>
+          <w:sz w:val="28"/>
+          <w:szCs w:val="28"/>
+          <w:lang w:eastAsia="ru-RU"/>
+        </w:rPr>
+      </w:r>
+    </w:p>
+    <w:p>
+      <w:pPr>
+        <w:pStyle w:val="Normal"/>
+        <w:spacing w:lineRule="auto" w:line="288" w:before="0" w:after="0"/>
+        <w:jc w:val="center"/>
+        <w:rPr>
+          <w:rFonts w:ascii="Times New Roman" w:hAnsi="Times New Roman" w:eastAsia="Times New Roman"/>
+          <w:b/>
+          <w:bCs/>
+          <w:iCs/>
+          <w:color w:val="000000"/>
+          <w:sz w:val="28"/>
+          <w:szCs w:val="28"/>
+          <w:lang w:eastAsia="ru-RU"/>
+        </w:rPr>
+      </w:pPr>
+      <w:r>
+        <w:rPr>
+          <w:rFonts w:eastAsia="Times New Roman" w:ascii="Times New Roman" w:hAnsi="Times New Roman"/>
+          <w:b/>
+          <w:bCs/>
+          <w:iCs/>
+          <w:color w:val="000000"/>
+          <w:sz w:val="28"/>
+          <w:szCs w:val="28"/>
+          <w:lang w:eastAsia="ru-RU"/>
+        </w:rPr>
+      </w:r>
+    </w:p>
+    <w:p>
+      <w:pPr>
+        <w:pStyle w:val="Normal"/>
+        <w:spacing w:lineRule="auto" w:line="288" w:before="0" w:after="0"/>
+        <w:jc w:val="center"/>
+        <w:rPr>
+          <w:rFonts w:ascii="Times New Roman" w:hAnsi="Times New Roman" w:eastAsia="Times New Roman"/>
+          <w:b/>
+          <w:bCs/>
+          <w:iCs/>
+          <w:color w:val="000000"/>
+          <w:sz w:val="28"/>
+          <w:szCs w:val="28"/>
+          <w:lang w:eastAsia="ru-RU"/>
+        </w:rPr>
+      </w:pPr>
+      <w:r>
+        <w:rPr>
+          <w:rFonts w:eastAsia="Times New Roman" w:ascii="Times New Roman" w:hAnsi="Times New Roman"/>
+          <w:b/>
+          <w:bCs/>
+          <w:iCs/>
+          <w:color w:val="000000"/>
+          <w:sz w:val="28"/>
+          <w:szCs w:val="28"/>
+          <w:lang w:eastAsia="ru-RU"/>
+        </w:rPr>
+      </w:r>
+    </w:p>
+    <w:p>
+      <w:pPr>
+        <w:pStyle w:val="Normal"/>
+        <w:spacing w:lineRule="auto" w:line="288" w:before="0" w:after="0"/>
+        <w:jc w:val="center"/>
+        <w:rPr>
+          <w:rFonts w:ascii="Times New Roman" w:hAnsi="Times New Roman" w:eastAsia="Times New Roman"/>
+          <w:b/>
+          <w:bCs/>
+          <w:iCs/>
+          <w:color w:val="000000"/>
+          <w:sz w:val="28"/>
+          <w:szCs w:val="28"/>
+          <w:lang w:eastAsia="ru-RU"/>
+        </w:rPr>
+      </w:pPr>
+      <w:r>
+        <w:rPr>
+          <w:rFonts w:eastAsia="Times New Roman" w:ascii="Times New Roman" w:hAnsi="Times New Roman"/>
+          <w:b/>
+          <w:bCs/>
+          <w:iCs/>
+          <w:color w:val="000000"/>
+          <w:sz w:val="28"/>
+          <w:szCs w:val="28"/>
+          <w:lang w:eastAsia="ru-RU"/>
+        </w:rPr>
+      </w:r>
+    </w:p>
+    <w:p>
+      <w:pPr>
+        <w:pStyle w:val="Normal"/>
+        <w:spacing w:lineRule="auto" w:line="288" w:before="0" w:after="0"/>
+        <w:jc w:val="center"/>
+        <w:rPr>
+          <w:rFonts w:ascii="Times New Roman" w:hAnsi="Times New Roman" w:eastAsia="Times New Roman"/>
+          <w:b/>
+          <w:bCs/>
+          <w:iCs/>
+          <w:color w:val="000000"/>
+          <w:sz w:val="28"/>
+          <w:szCs w:val="28"/>
+          <w:lang w:eastAsia="ru-RU"/>
+        </w:rPr>
+      </w:pPr>
+      <w:r>
+        <w:rPr>
+          <w:rFonts w:eastAsia="Times New Roman" w:ascii="Times New Roman" w:hAnsi="Times New Roman"/>
+          <w:b/>
+          <w:bCs/>
+          <w:iCs/>
+          <w:color w:val="000000"/>
+          <w:sz w:val="28"/>
+          <w:szCs w:val="28"/>
+          <w:lang w:eastAsia="ru-RU"/>
+        </w:rPr>
+      </w:r>
+    </w:p>
+    <w:p>
+      <w:pPr>
+        <w:pStyle w:val="Normal"/>
+        <w:spacing w:lineRule="auto" w:line="288" w:before="0" w:after="0"/>
+        <w:jc w:val="center"/>
+        <w:rPr>
+          <w:rFonts w:ascii="Times New Roman" w:hAnsi="Times New Roman" w:eastAsia="Times New Roman"/>
+          <w:b/>
+          <w:bCs/>
+          <w:iCs/>
+          <w:color w:val="000000"/>
+          <w:sz w:val="28"/>
+          <w:szCs w:val="28"/>
+          <w:lang w:eastAsia="ru-RU"/>
+        </w:rPr>
+      </w:pPr>
+      <w:r>
+        <w:rPr>
+          <w:rFonts w:eastAsia="Times New Roman" w:ascii="Times New Roman" w:hAnsi="Times New Roman"/>
+          <w:b/>
+          <w:bCs/>
+          <w:iCs/>
+          <w:color w:val="000000"/>
+          <w:sz w:val="28"/>
+          <w:szCs w:val="28"/>
+          <w:lang w:eastAsia="ru-RU"/>
+        </w:rPr>
+      </w:r>
+    </w:p>
+    <w:p>
+      <w:pPr>
+        <w:pStyle w:val="Normal"/>
+        <w:spacing w:lineRule="auto" w:line="288" w:before="0" w:after="0"/>
+        <w:jc w:val="center"/>
+        <w:rPr>
+          <w:rFonts w:ascii="Times New Roman" w:hAnsi="Times New Roman" w:eastAsia="Times New Roman"/>
+          <w:b/>
+          <w:bCs/>
+          <w:iCs/>
+          <w:color w:val="000000"/>
+          <w:sz w:val="28"/>
+          <w:szCs w:val="28"/>
+          <w:lang w:eastAsia="ru-RU"/>
+        </w:rPr>
+      </w:pPr>
+      <w:r>
+        <w:rPr>
+          <w:rFonts w:eastAsia="Times New Roman" w:ascii="Times New Roman" w:hAnsi="Times New Roman"/>
+          <w:b/>
+          <w:bCs/>
+          <w:iCs/>
+          <w:color w:val="000000"/>
+          <w:sz w:val="28"/>
+          <w:szCs w:val="28"/>
+          <w:lang w:eastAsia="ru-RU"/>
+        </w:rPr>
+      </w:r>
+    </w:p>
+    <w:p>
+      <w:pPr>
+        <w:pStyle w:val="Normal"/>
+        <w:spacing w:lineRule="auto" w:line="288" w:before="0" w:after="0"/>
+        <w:jc w:val="center"/>
+        <w:rPr>
+          <w:rFonts w:ascii="Times New Roman" w:hAnsi="Times New Roman" w:eastAsia="Times New Roman"/>
+          <w:b/>
+          <w:bCs/>
+          <w:iCs/>
+          <w:color w:val="000000"/>
+          <w:sz w:val="28"/>
+          <w:szCs w:val="28"/>
+          <w:lang w:eastAsia="ru-RU"/>
+        </w:rPr>
+      </w:pPr>
+      <w:r>
+        <w:rPr>
+          <w:rFonts w:eastAsia="Times New Roman" w:ascii="Times New Roman" w:hAnsi="Times New Roman"/>
+          <w:b/>
+          <w:bCs/>
+          <w:iCs/>
+          <w:color w:val="000000"/>
+          <w:sz w:val="28"/>
+          <w:szCs w:val="28"/>
+          <w:lang w:eastAsia="ru-RU"/>
+        </w:rPr>
+      </w:r>
+    </w:p>
+    <w:p>
+      <w:pPr>
+        <w:pStyle w:val="Normal"/>
+        <w:spacing w:lineRule="auto" w:line="288" w:before="0" w:after="0"/>
+        <w:jc w:val="center"/>
+        <w:rPr>
+          <w:rFonts w:ascii="Times New Roman" w:hAnsi="Times New Roman" w:eastAsia="Times New Roman"/>
+          <w:b/>
+          <w:bCs/>
+          <w:iCs/>
+          <w:color w:val="000000"/>
+          <w:sz w:val="28"/>
+          <w:szCs w:val="28"/>
+          <w:lang w:eastAsia="ru-RU"/>
+        </w:rPr>
+      </w:pPr>
+      <w:r>
+        <w:rPr>
+          <w:rFonts w:eastAsia="Times New Roman" w:ascii="Times New Roman" w:hAnsi="Times New Roman"/>
+          <w:b/>
+          <w:bCs/>
+          <w:iCs/>
+          <w:color w:val="000000"/>
+          <w:sz w:val="28"/>
+          <w:szCs w:val="28"/>
+          <w:lang w:eastAsia="ru-RU"/>
+        </w:rPr>
+      </w:r>
+    </w:p>
+    <w:p>
+      <w:pPr>
+        <w:pStyle w:val="Normal"/>
+        <w:spacing w:lineRule="auto" w:line="288" w:before="0" w:after="0"/>
+        <w:jc w:val="center"/>
+        <w:rPr>
+          <w:rFonts w:ascii="Times New Roman" w:hAnsi="Times New Roman" w:eastAsia="Times New Roman"/>
+          <w:b/>
+          <w:bCs/>
+          <w:iCs/>
+          <w:color w:val="000000"/>
+          <w:sz w:val="28"/>
+          <w:szCs w:val="28"/>
+          <w:lang w:eastAsia="ru-RU"/>
+        </w:rPr>
+      </w:pPr>
+      <w:r>
+        <w:rPr>
+          <w:rFonts w:eastAsia="Times New Roman" w:ascii="Times New Roman" w:hAnsi="Times New Roman"/>
+          <w:b/>
+          <w:bCs/>
+          <w:iCs/>
+          <w:color w:val="000000"/>
+          <w:sz w:val="28"/>
+          <w:szCs w:val="28"/>
+          <w:lang w:eastAsia="ru-RU"/>
+        </w:rPr>
+      </w:r>
+    </w:p>
+    <w:p>
+      <w:pPr>
+        <w:pStyle w:val="Normal"/>
+        <w:spacing w:lineRule="auto" w:line="288" w:before="0" w:after="0"/>
+        <w:jc w:val="center"/>
+        <w:rPr>
+          <w:rFonts w:ascii="Times New Roman" w:hAnsi="Times New Roman" w:eastAsia="Times New Roman"/>
+          <w:b/>
+          <w:bCs/>
+          <w:iCs/>
+          <w:color w:val="000000"/>
+          <w:sz w:val="28"/>
+          <w:szCs w:val="28"/>
+          <w:lang w:eastAsia="ru-RU"/>
+        </w:rPr>
+      </w:pPr>
+      <w:r>
+        <w:rPr>
+          <w:rFonts w:eastAsia="Times New Roman" w:ascii="Times New Roman" w:hAnsi="Times New Roman"/>
+          <w:b/>
+          <w:bCs/>
+          <w:iCs/>
+          <w:color w:val="000000"/>
+          <w:sz w:val="28"/>
+          <w:szCs w:val="28"/>
+          <w:lang w:eastAsia="ru-RU"/>
+        </w:rPr>
+      </w:r>
+    </w:p>
+    <w:p>
+      <w:pPr>
+        <w:pStyle w:val="Normal"/>
+        <w:spacing w:lineRule="auto" w:line="288" w:before="0" w:after="0"/>
+        <w:jc w:val="center"/>
+        <w:rPr>
+          <w:rFonts w:ascii="Times New Roman" w:hAnsi="Times New Roman" w:eastAsia="Times New Roman"/>
+          <w:b/>
+          <w:bCs/>
+          <w:iCs/>
+          <w:color w:val="000000"/>
+          <w:sz w:val="28"/>
+          <w:szCs w:val="28"/>
+          <w:lang w:eastAsia="ru-RU"/>
+        </w:rPr>
+      </w:pPr>
+      <w:r>
+        <w:rPr>
+          <w:rFonts w:eastAsia="Times New Roman" w:ascii="Times New Roman" w:hAnsi="Times New Roman"/>
+          <w:b/>
+          <w:bCs/>
+          <w:iCs/>
+          <w:color w:val="000000"/>
+          <w:sz w:val="28"/>
+          <w:szCs w:val="28"/>
+          <w:lang w:eastAsia="ru-RU"/>
+        </w:rPr>
+      </w:r>
+    </w:p>
+    <w:p>
+      <w:pPr>
+        <w:pStyle w:val="Normal"/>
+        <w:spacing w:lineRule="auto" w:line="288" w:before="0" w:after="0"/>
+        <w:jc w:val="center"/>
+        <w:rPr>
+          <w:rFonts w:ascii="Times New Roman" w:hAnsi="Times New Roman" w:eastAsia="Times New Roman"/>
+          <w:b/>
+          <w:bCs/>
+          <w:iCs/>
+          <w:color w:val="000000"/>
+          <w:sz w:val="28"/>
+          <w:szCs w:val="28"/>
+          <w:lang w:eastAsia="ru-RU"/>
+        </w:rPr>
+      </w:pPr>
+      <w:r>
+        <w:rPr>
+          <w:rFonts w:eastAsia="Times New Roman" w:ascii="Times New Roman" w:hAnsi="Times New Roman"/>
+          <w:b/>
+          <w:bCs/>
+          <w:iCs/>
+          <w:color w:val="000000"/>
+          <w:sz w:val="28"/>
+          <w:szCs w:val="28"/>
+          <w:lang w:eastAsia="ru-RU"/>
+        </w:rPr>
+      </w:r>
+    </w:p>
+    <w:p>
+      <w:pPr>
+        <w:pStyle w:val="Normal"/>
+        <w:spacing w:lineRule="auto" w:line="288" w:before="0" w:after="0"/>
+        <w:jc w:val="center"/>
+        <w:rPr>
+          <w:rFonts w:ascii="Times New Roman" w:hAnsi="Times New Roman" w:eastAsia="Times New Roman"/>
+          <w:b/>
+          <w:bCs/>
+          <w:iCs/>
+          <w:color w:val="000000"/>
+          <w:sz w:val="28"/>
+          <w:szCs w:val="28"/>
+          <w:lang w:eastAsia="ru-RU"/>
+        </w:rPr>
+      </w:pPr>
+      <w:r>
+        <w:rPr>
+          <w:rFonts w:eastAsia="Times New Roman" w:ascii="Times New Roman" w:hAnsi="Times New Roman"/>
+          <w:b/>
+          <w:bCs/>
+          <w:iCs/>
+          <w:color w:val="000000"/>
+          <w:sz w:val="28"/>
+          <w:szCs w:val="28"/>
+          <w:lang w:eastAsia="ru-RU"/>
+        </w:rPr>
+        <w:br/>
+      </w:r>
+    </w:p>
+    <w:p>
+      <w:pPr>
+        <w:pStyle w:val="Normal"/>
+        <w:spacing w:lineRule="auto" w:line="288" w:before="0" w:after="0"/>
+        <w:jc w:val="center"/>
+        <w:rPr>
+          <w:rFonts w:ascii="Times New Roman" w:hAnsi="Times New Roman" w:eastAsia="Times New Roman"/>
+          <w:b/>
+          <w:bCs/>
+          <w:iCs/>
+          <w:color w:val="000000"/>
+          <w:sz w:val="28"/>
+          <w:szCs w:val="28"/>
+          <w:lang w:eastAsia="ru-RU"/>
+        </w:rPr>
+      </w:pPr>
+      <w:r>
+        <w:rPr>
+          <w:rFonts w:eastAsia="Times New Roman" w:ascii="Times New Roman" w:hAnsi="Times New Roman"/>
+          <w:b/>
+          <w:bCs/>
+          <w:iCs/>
+          <w:color w:val="000000"/>
+          <w:sz w:val="28"/>
+          <w:szCs w:val="28"/>
+          <w:lang w:eastAsia="ru-RU"/>
+        </w:rPr>
+      </w:r>
+    </w:p>
+    <w:p>
+      <w:pPr>
+        <w:pStyle w:val="Normal"/>
+        <w:spacing w:lineRule="auto" w:line="288" w:before="0" w:after="0"/>
+        <w:jc w:val="center"/>
+        <w:rPr>
+          <w:rFonts w:ascii="Times New Roman" w:hAnsi="Times New Roman" w:eastAsia="Times New Roman"/>
+          <w:b/>
+          <w:bCs/>
+          <w:iCs/>
+          <w:color w:val="000000"/>
+          <w:sz w:val="28"/>
+          <w:szCs w:val="28"/>
+          <w:lang w:eastAsia="ru-RU"/>
+        </w:rPr>
+      </w:pPr>
+      <w:r>
+        <w:rPr>
+          <w:rFonts w:eastAsia="Times New Roman" w:ascii="Times New Roman" w:hAnsi="Times New Roman"/>
+          <w:b/>
+          <w:bCs/>
+          <w:iCs/>
+          <w:color w:val="000000"/>
+          <w:sz w:val="28"/>
+          <w:szCs w:val="28"/>
+          <w:lang w:eastAsia="ru-RU"/>
+        </w:rPr>
+      </w:r>
+    </w:p>
+    <w:p>
+      <w:pPr>
+        <w:pStyle w:val="Normal"/>
+        <w:spacing w:lineRule="auto" w:line="288" w:before="0" w:after="0"/>
+        <w:jc w:val="center"/>
+        <w:rPr>
+          <w:rFonts w:ascii="Times New Roman" w:hAnsi="Times New Roman" w:eastAsia="Times New Roman"/>
+          <w:b/>
+          <w:bCs/>
+          <w:iCs/>
+          <w:color w:val="000000"/>
+          <w:sz w:val="28"/>
+          <w:szCs w:val="28"/>
+          <w:lang w:eastAsia="ru-RU"/>
+        </w:rPr>
+      </w:pPr>
+      <w:r>
+        <w:rPr>
+          <w:rFonts w:eastAsia="Times New Roman" w:ascii="Times New Roman" w:hAnsi="Times New Roman"/>
+          <w:b/>
+          <w:bCs/>
+          <w:iCs/>
+          <w:color w:val="000000"/>
+          <w:sz w:val="28"/>
+          <w:szCs w:val="28"/>
+          <w:lang w:eastAsia="ru-RU"/>
+        </w:rPr>
+      </w:r>
+    </w:p>
+    <w:p>
+      <w:pPr>
+        <w:pStyle w:val="Normal"/>
+        <w:spacing w:lineRule="auto" w:line="288" w:before="0" w:after="0"/>
+        <w:jc w:val="center"/>
+        <w:rPr>
+          <w:rFonts w:ascii="Times New Roman" w:hAnsi="Times New Roman" w:eastAsia="Times New Roman"/>
+          <w:b/>
+          <w:bCs/>
+          <w:iCs/>
+          <w:color w:val="000000"/>
+          <w:sz w:val="28"/>
+          <w:szCs w:val="28"/>
+          <w:lang w:eastAsia="ru-RU"/>
+        </w:rPr>
+      </w:pPr>
+      <w:r>
+        <w:rPr>
+          <w:rFonts w:eastAsia="Times New Roman" w:ascii="Times New Roman" w:hAnsi="Times New Roman"/>
+          <w:b/>
+          <w:bCs/>
+          <w:iCs/>
+          <w:color w:val="000000"/>
+          <w:sz w:val="28"/>
+          <w:szCs w:val="28"/>
+          <w:lang w:eastAsia="ru-RU"/>
+        </w:rPr>
+      </w:r>
+    </w:p>
+    <w:p>
+      <w:pPr>
+        <w:pStyle w:val="Normal"/>
+        <w:spacing w:lineRule="auto" w:line="288" w:before="0" w:after="0"/>
+        <w:jc w:val="center"/>
+        <w:rPr>
+          <w:rFonts w:ascii="Times New Roman" w:hAnsi="Times New Roman" w:eastAsia="Times New Roman"/>
+          <w:b/>
+          <w:bCs/>
+          <w:iCs/>
+          <w:color w:val="000000"/>
+          <w:sz w:val="28"/>
+          <w:szCs w:val="28"/>
+          <w:lang w:eastAsia="ru-RU"/>
+        </w:rPr>
+      </w:pPr>
+      <w:r>
+        <w:rPr>
+          <w:rFonts w:eastAsia="Times New Roman" w:ascii="Times New Roman" w:hAnsi="Times New Roman"/>
+          <w:b/>
+          <w:bCs/>
+          <w:iCs/>
+          <w:color w:val="000000"/>
+          <w:sz w:val="28"/>
+          <w:szCs w:val="28"/>
+          <w:lang w:eastAsia="ru-RU"/>
+        </w:rPr>
+      </w:r>
+    </w:p>
+    <w:p>
+      <w:pPr>
+        <w:pStyle w:val="Normal"/>
+        <w:spacing w:lineRule="auto" w:line="288" w:before="0" w:after="0"/>
+        <w:jc w:val="center"/>
+        <w:rPr>
+          <w:rFonts w:ascii="Times New Roman" w:hAnsi="Times New Roman" w:eastAsia="Times New Roman"/>
+          <w:b/>
+          <w:bCs/>
+          <w:iCs/>
+          <w:color w:val="000000"/>
+          <w:sz w:val="28"/>
+          <w:szCs w:val="28"/>
+          <w:lang w:eastAsia="ru-RU"/>
+        </w:rPr>
+      </w:pPr>
+      <w:r>
+        <w:rPr>
+          <w:rFonts w:eastAsia="Times New Roman" w:ascii="Times New Roman" w:hAnsi="Times New Roman"/>
+          <w:b/>
+          <w:bCs/>
+          <w:iCs/>
+          <w:color w:val="000000"/>
+          <w:sz w:val="28"/>
+          <w:szCs w:val="28"/>
+          <w:lang w:eastAsia="ru-RU"/>
+        </w:rPr>
+        <w:drawing>
+          <wp:anchor distT="0" distB="0" distL="0" distR="0" simplePos="0" relativeHeight="7" behindDoc="0" locked="0" layoutInCell="0" allowOverlap="1">
+            <wp:simplePos x="0" y="0"/>
+            <wp:positionH relativeFrom="column">
+              <wp:align>center</wp:align>
+            </wp:positionH>
+            <wp:positionV relativeFrom="paragraph">
+              <wp:posOffset>635</wp:posOffset>
+            </wp:positionV>
+            <wp:extent cx="3761740" cy="390525"/>
+            <wp:effectExtent l="0" t="0" r="0" b="0"/>
+            <wp:wrapSquare wrapText="largest"/>
+            <wp:docPr id="5" name="Image5"/>
+            <wp:cNvGraphicFramePr>
+              <a:graphicFrameLocks xmlns:a="http://schemas.openxmlformats.org/drawingml/2006/main" noChangeAspect="1"/>
+            </wp:cNvGraphicFramePr>
+            <a:graphic xmlns:a="http://schemas.openxmlformats.org/drawingml/2006/main">
+              <a:graphicData uri="http://schemas.openxmlformats.org/drawingml/2006/picture">
+                <pic:pic xmlns:pic="http://schemas.openxmlformats.org/drawingml/2006/picture">
+                  <pic:nvPicPr>
+                    <pic:cNvPr id="5" name="Image5"/>
+                    <pic:cNvPicPr>
+                      <a:picLocks noChangeAspect="1" noChangeArrowheads="1"/>
+                    </pic:cNvPicPr>
+                  </pic:nvPicPr>
+                  <pic:blipFill>
+                    <a:blip r:embed="rId6"/>
+                    <a:stretch>
+                      <a:fillRect/>
+                    </a:stretch>
+                  </pic:blipFill>
+                  <pic:spPr bwMode="auto">
+                    <a:xfrm>
+                      <a:off x="0" y="0"/>
+                      <a:ext cx="3761740" cy="390525"/>
+                    </a:xfrm>
+                    <a:prstGeom prst="rect">
+                      <a:avLst/>
+                    </a:prstGeom>
+                    <a:noFill/>
+                  </pic:spPr>
+                </pic:pic>
+              </a:graphicData>
+            </a:graphic>
+          </wp:anchor>
+        </w:drawing>
+      </w:r>
+    </w:p>
+    <w:p>
+      <w:pPr>
+        <w:pStyle w:val="Normal"/>
+        <w:spacing w:lineRule="auto" w:line="288" w:before="0" w:after="0"/>
+        <w:jc w:val="center"/>
+        <w:rPr>
+          <w:rFonts w:ascii="Times New Roman" w:hAnsi="Times New Roman" w:eastAsia="Times New Roman"/>
+          <w:b/>
+          <w:bCs/>
+          <w:iCs/>
+          <w:color w:val="000000"/>
+          <w:sz w:val="28"/>
+          <w:szCs w:val="28"/>
+          <w:lang w:eastAsia="ru-RU"/>
+        </w:rPr>
+      </w:pPr>
+      <w:r>
+        <w:rPr>
+          <w:rFonts w:eastAsia="Times New Roman" w:ascii="Times New Roman" w:hAnsi="Times New Roman"/>
+          <w:b/>
+          <w:bCs/>
+          <w:iCs/>
+          <w:color w:val="000000"/>
+          <w:sz w:val="28"/>
+          <w:szCs w:val="28"/>
+          <w:lang w:eastAsia="ru-RU"/>
+        </w:rPr>
+      </w:r>
+    </w:p>
+    <w:p>
+      <w:pPr>
+        <w:pStyle w:val="Normal"/>
+        <w:spacing w:lineRule="auto" w:line="288" w:before="0" w:after="0"/>
+        <w:jc w:val="center"/>
+        <w:rPr>
+          <w:rFonts w:ascii="Times New Roman" w:hAnsi="Times New Roman" w:eastAsia="Times New Roman"/>
+          <w:b/>
+          <w:bCs/>
+          <w:iCs/>
+          <w:color w:val="000000"/>
+          <w:sz w:val="28"/>
+          <w:szCs w:val="28"/>
+          <w:lang w:eastAsia="ru-RU"/>
+        </w:rPr>
+      </w:pPr>
+      <w:r>
+        <w:rPr>
+          <w:rFonts w:eastAsia="Times New Roman" w:ascii="Times New Roman" w:hAnsi="Times New Roman"/>
+          <w:b/>
+          <w:bCs/>
+          <w:iCs/>
+          <w:color w:val="000000"/>
+          <w:sz w:val="28"/>
+          <w:szCs w:val="28"/>
+          <w:lang w:eastAsia="ru-RU"/>
+        </w:rPr>
+      </w:r>
+    </w:p>
+    <w:p>
+      <w:pPr>
+        <w:pStyle w:val="Normal"/>
+        <w:spacing w:lineRule="auto" w:line="288" w:before="0" w:after="0"/>
+        <w:jc w:val="center"/>
+        <w:rPr>
+          <w:rFonts w:ascii="Times New Roman" w:hAnsi="Times New Roman" w:eastAsia="Times New Roman"/>
+          <w:b/>
+          <w:bCs/>
+          <w:iCs/>
+          <w:color w:val="000000"/>
+          <w:sz w:val="28"/>
+          <w:szCs w:val="28"/>
+          <w:lang w:eastAsia="ru-RU"/>
+        </w:rPr>
+      </w:pPr>
+      <w:r>
+        <w:rPr>
+          <w:rFonts w:eastAsia="Times New Roman" w:ascii="Times New Roman" w:hAnsi="Times New Roman"/>
+          <w:b/>
+          <w:bCs/>
           <w:iCs/>
           <w:color w:val="000000"/>
           <w:sz w:val="28"/>
@@ -1785,13 +3550,13 @@
         </w:tblCellMar>
       </w:tblPr>
       <w:tblGrid>
-        <w:gridCol w:w="1523"/>
-        <w:gridCol w:w="771"/>
-        <w:gridCol w:w="769"/>
-        <w:gridCol w:w="794"/>
-        <w:gridCol w:w="794"/>
-        <w:gridCol w:w="820"/>
-        <w:gridCol w:w="967"/>
+        <w:gridCol w:w="1521"/>
+        <w:gridCol w:w="772"/>
+        <w:gridCol w:w="770"/>
+        <w:gridCol w:w="793"/>
+        <w:gridCol w:w="793"/>
+        <w:gridCol w:w="821"/>
+        <w:gridCol w:w="968"/>
         <w:gridCol w:w="797"/>
         <w:gridCol w:w="839"/>
       </w:tblGrid>
@@ -1801,7 +3566,7 @@
         </w:trPr>
         <w:tc>
           <w:tcPr>
-            <w:tcW w:w="1523" w:type="dxa"/>
+            <w:tcW w:w="1521" w:type="dxa"/>
             <w:tcBorders>
               <w:top w:val="single" w:sz="2" w:space="0" w:color="000000"/>
               <w:start w:val="single" w:sz="2" w:space="0" w:color="000000"/>
@@ -1828,7 +3593,7 @@
         </w:tc>
         <w:tc>
           <w:tcPr>
-            <w:tcW w:w="771" w:type="dxa"/>
+            <w:tcW w:w="772" w:type="dxa"/>
             <w:tcBorders>
               <w:top w:val="single" w:sz="2" w:space="0" w:color="000000"/>
               <w:start w:val="single" w:sz="2" w:space="0" w:color="000000"/>
@@ -1855,7 +3620,7 @@
         </w:tc>
         <w:tc>
           <w:tcPr>
-            <w:tcW w:w="769" w:type="dxa"/>
+            <w:tcW w:w="770" w:type="dxa"/>
             <w:tcBorders>
               <w:top w:val="single" w:sz="2" w:space="0" w:color="000000"/>
               <w:start w:val="single" w:sz="2" w:space="0" w:color="000000"/>
@@ -1882,7 +3647,7 @@
         </w:tc>
         <w:tc>
           <w:tcPr>
-            <w:tcW w:w="794" w:type="dxa"/>
+            <w:tcW w:w="793" w:type="dxa"/>
             <w:tcBorders>
               <w:top w:val="single" w:sz="2" w:space="0" w:color="000000"/>
               <w:start w:val="single" w:sz="2" w:space="0" w:color="000000"/>
@@ -1909,7 +3674,7 @@
         </w:tc>
         <w:tc>
           <w:tcPr>
-            <w:tcW w:w="794" w:type="dxa"/>
+            <w:tcW w:w="793" w:type="dxa"/>
             <w:tcBorders>
               <w:top w:val="single" w:sz="2" w:space="0" w:color="000000"/>
               <w:start w:val="single" w:sz="2" w:space="0" w:color="000000"/>
@@ -1936,7 +3701,7 @@
         </w:tc>
         <w:tc>
           <w:tcPr>
-            <w:tcW w:w="820" w:type="dxa"/>
+            <w:tcW w:w="821" w:type="dxa"/>
             <w:tcBorders>
               <w:top w:val="single" w:sz="2" w:space="0" w:color="000000"/>
               <w:start w:val="single" w:sz="2" w:space="0" w:color="000000"/>
@@ -1963,7 +3728,7 @@
         </w:tc>
         <w:tc>
           <w:tcPr>
-            <w:tcW w:w="967" w:type="dxa"/>
+            <w:tcW w:w="968" w:type="dxa"/>
             <w:tcBorders>
               <w:top w:val="single" w:sz="2" w:space="0" w:color="000000"/>
               <w:start w:val="single" w:sz="2" w:space="0" w:color="000000"/>
@@ -2047,7 +3812,7 @@
         <w:trPr/>
         <w:tc>
           <w:tcPr>
-            <w:tcW w:w="1523" w:type="dxa"/>
+            <w:tcW w:w="1521" w:type="dxa"/>
             <w:tcBorders>
               <w:top w:val="single" w:sz="2" w:space="0" w:color="000000"/>
               <w:start w:val="single" w:sz="2" w:space="0" w:color="000000"/>
@@ -2077,7 +3842,7 @@
         </w:tc>
         <w:tc>
           <w:tcPr>
-            <w:tcW w:w="771" w:type="dxa"/>
+            <w:tcW w:w="772" w:type="dxa"/>
             <w:tcBorders>
               <w:top w:val="single" w:sz="2" w:space="0" w:color="000000"/>
               <w:start w:val="single" w:sz="2" w:space="0" w:color="000000"/>
@@ -2105,7 +3870,7 @@
         </w:tc>
         <w:tc>
           <w:tcPr>
-            <w:tcW w:w="769" w:type="dxa"/>
+            <w:tcW w:w="770" w:type="dxa"/>
             <w:tcBorders>
               <w:top w:val="single" w:sz="2" w:space="0" w:color="000000"/>
               <w:start w:val="single" w:sz="2" w:space="0" w:color="000000"/>
@@ -2133,7 +3898,7 @@
         </w:tc>
         <w:tc>
           <w:tcPr>
-            <w:tcW w:w="794" w:type="dxa"/>
+            <w:tcW w:w="793" w:type="dxa"/>
             <w:tcBorders>
               <w:top w:val="single" w:sz="2" w:space="0" w:color="000000"/>
               <w:start w:val="single" w:sz="2" w:space="0" w:color="000000"/>
@@ -2161,7 +3926,7 @@
         </w:tc>
         <w:tc>
           <w:tcPr>
-            <w:tcW w:w="794" w:type="dxa"/>
+            <w:tcW w:w="793" w:type="dxa"/>
             <w:tcBorders>
               <w:top w:val="single" w:sz="2" w:space="0" w:color="000000"/>
               <w:start w:val="single" w:sz="2" w:space="0" w:color="000000"/>
@@ -2189,7 +3954,7 @@
         </w:tc>
         <w:tc>
           <w:tcPr>
-            <w:tcW w:w="820" w:type="dxa"/>
+            <w:tcW w:w="821" w:type="dxa"/>
             <w:tcBorders>
               <w:top w:val="single" w:sz="2" w:space="0" w:color="000000"/>
               <w:start w:val="single" w:sz="2" w:space="0" w:color="000000"/>
@@ -2219,7 +3984,7 @@
         </w:tc>
         <w:tc>
           <w:tcPr>
-            <w:tcW w:w="967" w:type="dxa"/>
+            <w:tcW w:w="968" w:type="dxa"/>
             <w:tcBorders>
               <w:top w:val="single" w:sz="2" w:space="0" w:color="000000"/>
               <w:start w:val="single" w:sz="2" w:space="0" w:color="000000"/>
@@ -2308,7 +4073,7 @@
         <w:trPr/>
         <w:tc>
           <w:tcPr>
-            <w:tcW w:w="1523" w:type="dxa"/>
+            <w:tcW w:w="1521" w:type="dxa"/>
             <w:tcBorders>
               <w:top w:val="single" w:sz="2" w:space="0" w:color="000000"/>
               <w:start w:val="single" w:sz="2" w:space="0" w:color="000000"/>
@@ -2338,7 +4103,7 @@
         </w:tc>
         <w:tc>
           <w:tcPr>
-            <w:tcW w:w="771" w:type="dxa"/>
+            <w:tcW w:w="772" w:type="dxa"/>
             <w:tcBorders>
               <w:top w:val="single" w:sz="2" w:space="0" w:color="000000"/>
               <w:start w:val="single" w:sz="2" w:space="0" w:color="000000"/>
@@ -2366,7 +4131,7 @@
         </w:tc>
         <w:tc>
           <w:tcPr>
-            <w:tcW w:w="769" w:type="dxa"/>
+            <w:tcW w:w="770" w:type="dxa"/>
             <w:tcBorders>
               <w:top w:val="single" w:sz="2" w:space="0" w:color="000000"/>
               <w:start w:val="single" w:sz="2" w:space="0" w:color="000000"/>
@@ -2394,7 +4159,7 @@
         </w:tc>
         <w:tc>
           <w:tcPr>
-            <w:tcW w:w="794" w:type="dxa"/>
+            <w:tcW w:w="793" w:type="dxa"/>
             <w:tcBorders>
               <w:top w:val="single" w:sz="2" w:space="0" w:color="000000"/>
               <w:start w:val="single" w:sz="2" w:space="0" w:color="000000"/>
@@ -2422,7 +4187,7 @@
         </w:tc>
         <w:tc>
           <w:tcPr>
-            <w:tcW w:w="794" w:type="dxa"/>
+            <w:tcW w:w="793" w:type="dxa"/>
             <w:tcBorders>
               <w:top w:val="single" w:sz="2" w:space="0" w:color="000000"/>
               <w:start w:val="single" w:sz="2" w:space="0" w:color="000000"/>
@@ -2450,7 +4215,7 @@
         </w:tc>
         <w:tc>
           <w:tcPr>
-            <w:tcW w:w="820" w:type="dxa"/>
+            <w:tcW w:w="821" w:type="dxa"/>
             <w:tcBorders>
               <w:top w:val="single" w:sz="2" w:space="0" w:color="000000"/>
               <w:start w:val="single" w:sz="2" w:space="0" w:color="000000"/>
@@ -2480,7 +4245,7 @@
         </w:tc>
         <w:tc>
           <w:tcPr>
-            <w:tcW w:w="967" w:type="dxa"/>
+            <w:tcW w:w="968" w:type="dxa"/>
             <w:tcBorders>
               <w:top w:val="single" w:sz="2" w:space="0" w:color="000000"/>
               <w:start w:val="single" w:sz="2" w:space="0" w:color="000000"/>
@@ -2569,7 +4334,7 @@
         <w:trPr/>
         <w:tc>
           <w:tcPr>
-            <w:tcW w:w="1523" w:type="dxa"/>
+            <w:tcW w:w="1521" w:type="dxa"/>
             <w:tcBorders>
               <w:top w:val="single" w:sz="2" w:space="0" w:color="000000"/>
               <w:start w:val="single" w:sz="2" w:space="0" w:color="000000"/>
@@ -2599,7 +4364,7 @@
         </w:tc>
         <w:tc>
           <w:tcPr>
-            <w:tcW w:w="771" w:type="dxa"/>
+            <w:tcW w:w="772" w:type="dxa"/>
             <w:tcBorders>
               <w:top w:val="single" w:sz="2" w:space="0" w:color="000000"/>
               <w:start w:val="single" w:sz="2" w:space="0" w:color="000000"/>
@@ -2627,7 +4392,7 @@
         </w:tc>
         <w:tc>
           <w:tcPr>
-            <w:tcW w:w="769" w:type="dxa"/>
+            <w:tcW w:w="770" w:type="dxa"/>
             <w:tcBorders>
               <w:top w:val="single" w:sz="2" w:space="0" w:color="000000"/>
               <w:start w:val="single" w:sz="2" w:space="0" w:color="000000"/>
@@ -2655,7 +4420,7 @@
         </w:tc>
         <w:tc>
           <w:tcPr>
-            <w:tcW w:w="794" w:type="dxa"/>
+            <w:tcW w:w="793" w:type="dxa"/>
             <w:tcBorders>
               <w:top w:val="single" w:sz="2" w:space="0" w:color="000000"/>
               <w:start w:val="single" w:sz="2" w:space="0" w:color="000000"/>
@@ -2683,7 +4448,7 @@
         </w:tc>
         <w:tc>
           <w:tcPr>
-            <w:tcW w:w="794" w:type="dxa"/>
+            <w:tcW w:w="793" w:type="dxa"/>
             <w:tcBorders>
               <w:top w:val="single" w:sz="2" w:space="0" w:color="000000"/>
               <w:start w:val="single" w:sz="2" w:space="0" w:color="000000"/>
@@ -2711,7 +4476,7 @@
         </w:tc>
         <w:tc>
           <w:tcPr>
-            <w:tcW w:w="820" w:type="dxa"/>
+            <w:tcW w:w="821" w:type="dxa"/>
             <w:tcBorders>
               <w:top w:val="single" w:sz="2" w:space="0" w:color="000000"/>
               <w:start w:val="single" w:sz="2" w:space="0" w:color="000000"/>
@@ -2741,7 +4506,7 @@
         </w:tc>
         <w:tc>
           <w:tcPr>
-            <w:tcW w:w="967" w:type="dxa"/>
+            <w:tcW w:w="968" w:type="dxa"/>
             <w:tcBorders>
               <w:top w:val="single" w:sz="2" w:space="0" w:color="000000"/>
               <w:start w:val="single" w:sz="2" w:space="0" w:color="000000"/>
@@ -2830,7 +4595,7 @@
         <w:trPr/>
         <w:tc>
           <w:tcPr>
-            <w:tcW w:w="1523" w:type="dxa"/>
+            <w:tcW w:w="1521" w:type="dxa"/>
             <w:tcBorders>
               <w:top w:val="single" w:sz="2" w:space="0" w:color="000000"/>
               <w:start w:val="single" w:sz="2" w:space="0" w:color="000000"/>
@@ -2860,7 +4625,7 @@
         </w:tc>
         <w:tc>
           <w:tcPr>
-            <w:tcW w:w="771" w:type="dxa"/>
+            <w:tcW w:w="772" w:type="dxa"/>
             <w:tcBorders>
               <w:top w:val="single" w:sz="2" w:space="0" w:color="000000"/>
               <w:start w:val="single" w:sz="2" w:space="0" w:color="000000"/>
@@ -2888,7 +4653,7 @@
         </w:tc>
         <w:tc>
           <w:tcPr>
-            <w:tcW w:w="769" w:type="dxa"/>
+            <w:tcW w:w="770" w:type="dxa"/>
             <w:tcBorders>
               <w:top w:val="single" w:sz="2" w:space="0" w:color="000000"/>
               <w:start w:val="single" w:sz="2" w:space="0" w:color="000000"/>
@@ -2916,7 +4681,7 @@
         </w:tc>
         <w:tc>
           <w:tcPr>
-            <w:tcW w:w="794" w:type="dxa"/>
+            <w:tcW w:w="793" w:type="dxa"/>
             <w:tcBorders>
               <w:top w:val="single" w:sz="2" w:space="0" w:color="000000"/>
               <w:start w:val="single" w:sz="2" w:space="0" w:color="000000"/>
@@ -2944,7 +4709,7 @@
         </w:tc>
         <w:tc>
           <w:tcPr>
-            <w:tcW w:w="794" w:type="dxa"/>
+            <w:tcW w:w="793" w:type="dxa"/>
             <w:tcBorders>
               <w:top w:val="single" w:sz="2" w:space="0" w:color="000000"/>
               <w:start w:val="single" w:sz="2" w:space="0" w:color="000000"/>
@@ -2972,7 +4737,7 @@
         </w:tc>
         <w:tc>
           <w:tcPr>
-            <w:tcW w:w="820" w:type="dxa"/>
+            <w:tcW w:w="821" w:type="dxa"/>
             <w:tcBorders>
               <w:top w:val="single" w:sz="2" w:space="0" w:color="000000"/>
               <w:start w:val="single" w:sz="2" w:space="0" w:color="000000"/>
@@ -3002,7 +4767,7 @@
         </w:tc>
         <w:tc>
           <w:tcPr>
-            <w:tcW w:w="967" w:type="dxa"/>
+            <w:tcW w:w="968" w:type="dxa"/>
             <w:tcBorders>
               <w:top w:val="single" w:sz="2" w:space="0" w:color="000000"/>
               <w:start w:val="single" w:sz="2" w:space="0" w:color="000000"/>
@@ -3091,7 +4856,7 @@
         <w:trPr/>
         <w:tc>
           <w:tcPr>
-            <w:tcW w:w="1523" w:type="dxa"/>
+            <w:tcW w:w="1521" w:type="dxa"/>
             <w:tcBorders>
               <w:top w:val="single" w:sz="2" w:space="0" w:color="000000"/>
               <w:start w:val="single" w:sz="2" w:space="0" w:color="000000"/>
@@ -3121,7 +4886,7 @@
         </w:tc>
         <w:tc>
           <w:tcPr>
-            <w:tcW w:w="771" w:type="dxa"/>
+            <w:tcW w:w="772" w:type="dxa"/>
             <w:tcBorders>
               <w:top w:val="single" w:sz="2" w:space="0" w:color="000000"/>
               <w:start w:val="single" w:sz="2" w:space="0" w:color="000000"/>
@@ -3149,7 +4914,7 @@
         </w:tc>
         <w:tc>
           <w:tcPr>
-            <w:tcW w:w="769" w:type="dxa"/>
+            <w:tcW w:w="770" w:type="dxa"/>
             <w:tcBorders>
               <w:top w:val="single" w:sz="2" w:space="0" w:color="000000"/>
               <w:start w:val="single" w:sz="2" w:space="0" w:color="000000"/>
@@ -3177,7 +4942,7 @@
         </w:tc>
         <w:tc>
           <w:tcPr>
-            <w:tcW w:w="794" w:type="dxa"/>
+            <w:tcW w:w="793" w:type="dxa"/>
             <w:tcBorders>
               <w:top w:val="single" w:sz="2" w:space="0" w:color="000000"/>
               <w:start w:val="single" w:sz="2" w:space="0" w:color="000000"/>
@@ -3205,7 +4970,7 @@
         </w:tc>
         <w:tc>
           <w:tcPr>
-            <w:tcW w:w="794" w:type="dxa"/>
+            <w:tcW w:w="793" w:type="dxa"/>
             <w:tcBorders>
               <w:top w:val="single" w:sz="2" w:space="0" w:color="000000"/>
               <w:start w:val="single" w:sz="2" w:space="0" w:color="000000"/>
@@ -3233,7 +4998,7 @@
         </w:tc>
         <w:tc>
           <w:tcPr>
-            <w:tcW w:w="820" w:type="dxa"/>
+            <w:tcW w:w="821" w:type="dxa"/>
             <w:tcBorders>
               <w:top w:val="single" w:sz="2" w:space="0" w:color="000000"/>
               <w:start w:val="single" w:sz="2" w:space="0" w:color="000000"/>
@@ -3263,7 +5028,7 @@
         </w:tc>
         <w:tc>
           <w:tcPr>
-            <w:tcW w:w="967" w:type="dxa"/>
+            <w:tcW w:w="968" w:type="dxa"/>
             <w:tcBorders>
               <w:top w:val="single" w:sz="2" w:space="0" w:color="000000"/>
               <w:start w:val="single" w:sz="2" w:space="0" w:color="000000"/>
@@ -3352,7 +5117,7 @@
         <w:trPr/>
         <w:tc>
           <w:tcPr>
-            <w:tcW w:w="1523" w:type="dxa"/>
+            <w:tcW w:w="1521" w:type="dxa"/>
             <w:tcBorders>
               <w:top w:val="single" w:sz="2" w:space="0" w:color="000000"/>
               <w:start w:val="single" w:sz="2" w:space="0" w:color="000000"/>
@@ -3382,7 +5147,7 @@
         </w:tc>
         <w:tc>
           <w:tcPr>
-            <w:tcW w:w="771" w:type="dxa"/>
+            <w:tcW w:w="772" w:type="dxa"/>
             <w:tcBorders>
               <w:top w:val="single" w:sz="2" w:space="0" w:color="000000"/>
               <w:start w:val="single" w:sz="2" w:space="0" w:color="000000"/>
@@ -3410,7 +5175,7 @@
         </w:tc>
         <w:tc>
           <w:tcPr>
-            <w:tcW w:w="769" w:type="dxa"/>
+            <w:tcW w:w="770" w:type="dxa"/>
             <w:tcBorders>
               <w:top w:val="single" w:sz="2" w:space="0" w:color="000000"/>
               <w:start w:val="single" w:sz="2" w:space="0" w:color="000000"/>
@@ -3438,7 +5203,7 @@
         </w:tc>
         <w:tc>
           <w:tcPr>
-            <w:tcW w:w="794" w:type="dxa"/>
+            <w:tcW w:w="793" w:type="dxa"/>
             <w:tcBorders>
               <w:top w:val="single" w:sz="2" w:space="0" w:color="000000"/>
               <w:start w:val="single" w:sz="2" w:space="0" w:color="000000"/>
@@ -3466,7 +5231,7 @@
         </w:tc>
         <w:tc>
           <w:tcPr>
-            <w:tcW w:w="794" w:type="dxa"/>
+            <w:tcW w:w="793" w:type="dxa"/>
             <w:tcBorders>
               <w:top w:val="single" w:sz="2" w:space="0" w:color="000000"/>
               <w:start w:val="single" w:sz="2" w:space="0" w:color="000000"/>
@@ -3494,7 +5259,7 @@
         </w:tc>
         <w:tc>
           <w:tcPr>
-            <w:tcW w:w="820" w:type="dxa"/>
+            <w:tcW w:w="821" w:type="dxa"/>
             <w:tcBorders>
               <w:top w:val="single" w:sz="2" w:space="0" w:color="000000"/>
               <w:start w:val="single" w:sz="2" w:space="0" w:color="000000"/>
@@ -3524,7 +5289,7 @@
         </w:tc>
         <w:tc>
           <w:tcPr>
-            <w:tcW w:w="967" w:type="dxa"/>
+            <w:tcW w:w="968" w:type="dxa"/>
             <w:tcBorders>
               <w:top w:val="single" w:sz="2" w:space="0" w:color="000000"/>
               <w:start w:val="single" w:sz="2" w:space="0" w:color="000000"/>
@@ -3613,7 +5378,7 @@
         <w:trPr/>
         <w:tc>
           <w:tcPr>
-            <w:tcW w:w="1523" w:type="dxa"/>
+            <w:tcW w:w="1521" w:type="dxa"/>
             <w:tcBorders>
               <w:top w:val="single" w:sz="2" w:space="0" w:color="000000"/>
               <w:start w:val="single" w:sz="2" w:space="0" w:color="000000"/>
@@ -3643,7 +5408,7 @@
         </w:tc>
         <w:tc>
           <w:tcPr>
-            <w:tcW w:w="771" w:type="dxa"/>
+            <w:tcW w:w="772" w:type="dxa"/>
             <w:tcBorders>
               <w:top w:val="single" w:sz="2" w:space="0" w:color="000000"/>
               <w:start w:val="single" w:sz="2" w:space="0" w:color="000000"/>
@@ -3671,7 +5436,7 @@
         </w:tc>
         <w:tc>
           <w:tcPr>
-            <w:tcW w:w="769" w:type="dxa"/>
+            <w:tcW w:w="770" w:type="dxa"/>
             <w:tcBorders>
               <w:top w:val="single" w:sz="2" w:space="0" w:color="000000"/>
               <w:start w:val="single" w:sz="2" w:space="0" w:color="000000"/>
@@ -3699,7 +5464,7 @@
         </w:tc>
         <w:tc>
           <w:tcPr>
-            <w:tcW w:w="794" w:type="dxa"/>
+            <w:tcW w:w="793" w:type="dxa"/>
             <w:tcBorders>
               <w:top w:val="single" w:sz="2" w:space="0" w:color="000000"/>
               <w:start w:val="single" w:sz="2" w:space="0" w:color="000000"/>
@@ -3727,7 +5492,7 @@
         </w:tc>
         <w:tc>
           <w:tcPr>
-            <w:tcW w:w="794" w:type="dxa"/>
+            <w:tcW w:w="793" w:type="dxa"/>
             <w:tcBorders>
               <w:top w:val="single" w:sz="2" w:space="0" w:color="000000"/>
               <w:start w:val="single" w:sz="2" w:space="0" w:color="000000"/>
@@ -3755,7 +5520,7 @@
         </w:tc>
         <w:tc>
           <w:tcPr>
-            <w:tcW w:w="820" w:type="dxa"/>
+            <w:tcW w:w="821" w:type="dxa"/>
             <w:tcBorders>
               <w:top w:val="single" w:sz="2" w:space="0" w:color="000000"/>
               <w:start w:val="single" w:sz="2" w:space="0" w:color="000000"/>
@@ -3785,7 +5550,7 @@
         </w:tc>
         <w:tc>
           <w:tcPr>
-            <w:tcW w:w="967" w:type="dxa"/>
+            <w:tcW w:w="968" w:type="dxa"/>
             <w:tcBorders>
               <w:top w:val="single" w:sz="2" w:space="0" w:color="000000"/>
               <w:start w:val="single" w:sz="2" w:space="0" w:color="000000"/>
@@ -3874,7 +5639,7 @@
         <w:trPr/>
         <w:tc>
           <w:tcPr>
-            <w:tcW w:w="1523" w:type="dxa"/>
+            <w:tcW w:w="1521" w:type="dxa"/>
             <w:tcBorders>
               <w:top w:val="single" w:sz="2" w:space="0" w:color="000000"/>
               <w:start w:val="single" w:sz="2" w:space="0" w:color="000000"/>
@@ -3904,7 +5669,7 @@
         </w:tc>
         <w:tc>
           <w:tcPr>
-            <w:tcW w:w="771" w:type="dxa"/>
+            <w:tcW w:w="772" w:type="dxa"/>
             <w:tcBorders>
               <w:top w:val="single" w:sz="2" w:space="0" w:color="000000"/>
               <w:start w:val="single" w:sz="2" w:space="0" w:color="000000"/>
@@ -3932,7 +5697,7 @@
         </w:tc>
         <w:tc>
           <w:tcPr>
-            <w:tcW w:w="769" w:type="dxa"/>
+            <w:tcW w:w="770" w:type="dxa"/>
             <w:tcBorders>
               <w:top w:val="single" w:sz="2" w:space="0" w:color="000000"/>
               <w:start w:val="single" w:sz="2" w:space="0" w:color="000000"/>
@@ -3960,7 +5725,7 @@
         </w:tc>
         <w:tc>
           <w:tcPr>
-            <w:tcW w:w="794" w:type="dxa"/>
+            <w:tcW w:w="793" w:type="dxa"/>
             <w:tcBorders>
               <w:top w:val="single" w:sz="2" w:space="0" w:color="000000"/>
               <w:start w:val="single" w:sz="2" w:space="0" w:color="000000"/>
@@ -3988,7 +5753,7 @@
         </w:tc>
         <w:tc>
           <w:tcPr>
-            <w:tcW w:w="794" w:type="dxa"/>
+            <w:tcW w:w="793" w:type="dxa"/>
             <w:tcBorders>
               <w:top w:val="single" w:sz="2" w:space="0" w:color="000000"/>
               <w:start w:val="single" w:sz="2" w:space="0" w:color="000000"/>
@@ -4016,7 +5781,7 @@
         </w:tc>
         <w:tc>
           <w:tcPr>
-            <w:tcW w:w="820" w:type="dxa"/>
+            <w:tcW w:w="821" w:type="dxa"/>
             <w:tcBorders>
               <w:top w:val="single" w:sz="2" w:space="0" w:color="000000"/>
               <w:start w:val="single" w:sz="2" w:space="0" w:color="000000"/>
@@ -4046,7 +5811,7 @@
         </w:tc>
         <w:tc>
           <w:tcPr>
-            <w:tcW w:w="967" w:type="dxa"/>
+            <w:tcW w:w="968" w:type="dxa"/>
             <w:tcBorders>
               <w:top w:val="single" w:sz="2" w:space="0" w:color="000000"/>
               <w:start w:val="single" w:sz="2" w:space="0" w:color="000000"/>
@@ -4652,22 +6417,17 @@
         <w:pStyle w:val="Normal"/>
         <w:spacing w:lineRule="auto" w:line="288" w:before="0" w:after="0"/>
         <w:ind w:start="-567"/>
-        <w:rPr>
-          <w:rFonts w:ascii="Times New Roman" w:hAnsi="Times New Roman" w:eastAsia="Times New Roman"/>
-          <w:color w:val="000000"/>
-          <w:sz w:val="28"/>
-          <w:szCs w:val="28"/>
-          <w:lang w:eastAsia="ru-RU"/>
-        </w:rPr>
-      </w:pPr>
-      <w:r>
-        <w:rPr>
-          <w:rFonts w:eastAsia="Times New Roman" w:ascii="Times New Roman" w:hAnsi="Times New Roman"/>
-          <w:color w:val="000000"/>
-          <w:sz w:val="28"/>
-          <w:szCs w:val="28"/>
-          <w:lang w:eastAsia="ru-RU"/>
-        </w:rPr>
+        <w:jc w:val="start"/>
+        <w:rPr>
+          <w:rFonts w:ascii="Times New Roman" w:hAnsi="Times New Roman" w:eastAsia="Times New Roman"/>
+          <w:color w:val="000000"/>
+          <w:sz w:val="28"/>
+          <w:szCs w:val="28"/>
+          <w:lang w:eastAsia="ru-RU"/>
+        </w:rPr>
+      </w:pPr>
+      <w:r>
+        <w:rPr/>
       </w:r>
       <m:oMathPara xmlns:m="http://schemas.openxmlformats.org/officeDocument/2006/math">
         <m:oMathParaPr>
@@ -4681,6 +6441,10 @@
             <m:t xml:space="preserve">H</m:t>
           </m:r>
           <m:r>
+            <m:rPr>
+              <m:lit/>
+              <m:nor/>
+            </m:rPr>
             <m:t xml:space="preserve">=</m:t>
           </m:r>
           <m:r>
@@ -4758,6 +6522,10 @@
                 </m:sup>
               </m:sSup>
               <m:r>
+                <m:rPr>
+                  <m:lit/>
+                  <m:nor/>
+                </m:rPr>
                 <m:t xml:space="preserve">+</m:t>
               </m:r>
               <m:sSubSup>
@@ -4824,6 +6592,10 @@
             </m:e>
           </m:rad>
           <m:r>
+            <m:rPr>
+              <m:lit/>
+              <m:nor/>
+            </m:rPr>
             <m:t xml:space="preserve">=</m:t>
           </m:r>
           <m:r>
@@ -4886,6 +6658,10 @@
                 </m:sup>
               </m:sSup>
               <m:r>
+                <m:rPr>
+                  <m:lit/>
+                  <m:nor/>
+                </m:rPr>
                 <m:t xml:space="preserve">+</m:t>
               </m:r>
               <m:sSup>
@@ -4938,12 +6714,20 @@
             </m:e>
           </m:rad>
           <m:r>
+            <m:rPr>
+              <m:lit/>
+              <m:nor/>
+            </m:rPr>
             <m:t xml:space="preserve">=</m:t>
           </m:r>
           <m:r>
             <m:t xml:space="preserve">0,278</m:t>
           </m:r>
           <m:r>
+            <m:rPr>
+              <m:lit/>
+              <m:nor/>
+            </m:rPr>
             <m:t xml:space="preserve"> </m:t>
           </m:r>
           <m:r>
@@ -4984,22 +6768,17 @@
         <w:pStyle w:val="Normal"/>
         <w:spacing w:lineRule="auto" w:line="288" w:before="0" w:after="0"/>
         <w:ind w:start="-567"/>
-        <w:rPr>
-          <w:rFonts w:ascii="Times New Roman" w:hAnsi="Times New Roman" w:eastAsia="Times New Roman"/>
-          <w:color w:val="000000"/>
-          <w:sz w:val="28"/>
-          <w:szCs w:val="28"/>
-          <w:lang w:eastAsia="ru-RU"/>
-        </w:rPr>
-      </w:pPr>
-      <w:r>
-        <w:rPr>
-          <w:rFonts w:eastAsia="Times New Roman" w:ascii="Times New Roman" w:hAnsi="Times New Roman"/>
-          <w:color w:val="000000"/>
-          <w:sz w:val="28"/>
-          <w:szCs w:val="28"/>
-          <w:lang w:eastAsia="ru-RU"/>
-        </w:rPr>
+        <w:jc w:val="start"/>
+        <w:rPr>
+          <w:rFonts w:ascii="Times New Roman" w:hAnsi="Times New Roman" w:eastAsia="Times New Roman"/>
+          <w:color w:val="000000"/>
+          <w:sz w:val="28"/>
+          <w:szCs w:val="28"/>
+          <w:lang w:eastAsia="ru-RU"/>
+        </w:rPr>
+      </w:pPr>
+      <w:r>
+        <w:rPr/>
       </w:r>
       <m:oMathPara xmlns:m="http://schemas.openxmlformats.org/officeDocument/2006/math">
         <m:oMathParaPr>
@@ -5013,6 +6792,10 @@
             <m:t xml:space="preserve">B</m:t>
           </m:r>
           <m:r>
+            <m:rPr>
+              <m:lit/>
+              <m:nor/>
+            </m:rPr>
             <m:t xml:space="preserve">=</m:t>
           </m:r>
           <m:r>
@@ -5090,6 +6873,10 @@
                 </m:sup>
               </m:sSup>
               <m:r>
+                <m:rPr>
+                  <m:lit/>
+                  <m:nor/>
+                </m:rPr>
                 <m:t xml:space="preserve">+</m:t>
               </m:r>
               <m:sSubSup>
@@ -5156,6 +6943,10 @@
             </m:e>
           </m:rad>
           <m:r>
+            <m:rPr>
+              <m:lit/>
+              <m:nor/>
+            </m:rPr>
             <m:t xml:space="preserve">=</m:t>
           </m:r>
           <m:r>
@@ -5218,6 +7009,10 @@
                 </m:sup>
               </m:sSup>
               <m:r>
+                <m:rPr>
+                  <m:lit/>
+                  <m:nor/>
+                </m:rPr>
                 <m:t xml:space="preserve">+</m:t>
               </m:r>
               <m:sSup>
@@ -5270,12 +7065,20 @@
             </m:e>
           </m:rad>
           <m:r>
+            <m:rPr>
+              <m:lit/>
+              <m:nor/>
+            </m:rPr>
             <m:t xml:space="preserve">=</m:t>
           </m:r>
           <m:r>
             <m:t xml:space="preserve">0,0031</m:t>
           </m:r>
           <m:r>
+            <m:rPr>
+              <m:lit/>
+              <m:nor/>
+            </m:rPr>
             <m:t xml:space="preserve"> </m:t>
           </m:r>
           <m:r>
@@ -5303,7 +7106,32 @@
       </w:pPr>
       <w:r>
         <w:rPr>
+          <w:rFonts w:eastAsia="Times New Roman" w:ascii="Times New Roman" w:hAnsi="Times New Roman"/>
+          <w:color w:val="000000"/>
+          <w:sz w:val="28"/>
+          <w:szCs w:val="28"/>
+          <w:lang w:eastAsia="ru-RU"/>
+        </w:rPr>
+      </w:r>
+    </w:p>
+    <w:p>
+      <w:pPr>
+        <w:pStyle w:val="Normal"/>
+        <w:spacing w:lineRule="auto" w:line="288" w:before="0" w:after="0"/>
+        <w:rPr>
+          <w:rFonts w:ascii="Times New Roman" w:hAnsi="Times New Roman" w:eastAsia="" w:eastAsiaTheme="minorEastAsia"/>
+          <w:b/>
+          <w:bCs/>
+          <w:sz w:val="28"/>
+          <w:szCs w:val="28"/>
+          <w:lang w:eastAsia="ru-RU"/>
+        </w:rPr>
+      </w:pPr>
+      <w:r>
+        <w:rPr>
           <w:rFonts w:eastAsia="" w:eastAsiaTheme="minorEastAsia" w:ascii="Times New Roman" w:hAnsi="Times New Roman"/>
+          <w:b/>
+          <w:bCs/>
           <w:sz w:val="28"/>
           <w:szCs w:val="28"/>
           <w:lang w:eastAsia="ru-RU"/>
@@ -5316,22 +7144,19 @@
         <w:spacing w:lineRule="auto" w:line="288" w:before="0" w:after="0"/>
         <w:rPr>
           <w:rFonts w:ascii="Times New Roman" w:hAnsi="Times New Roman" w:eastAsia="" w:eastAsiaTheme="minorEastAsia"/>
-          <w:b/>
-          <w:bCs/>
-          <w:sz w:val="28"/>
-          <w:szCs w:val="28"/>
-          <w:lang w:eastAsia="ru-RU"/>
-        </w:rPr>
-      </w:pPr>
-      <w:r>
-        <w:rPr>
-          <w:rFonts w:eastAsia="" w:eastAsiaTheme="minorEastAsia" w:ascii="Times New Roman" w:hAnsi="Times New Roman"/>
-          <w:b/>
-          <w:bCs/>
-          <w:sz w:val="28"/>
-          <w:szCs w:val="28"/>
-          <w:lang w:eastAsia="ru-RU"/>
-        </w:rPr>
+          <w:sz w:val="28"/>
+          <w:szCs w:val="28"/>
+          <w:lang w:eastAsia="ru-RU"/>
+        </w:rPr>
+      </w:pPr>
+      <w:r>
+        <w:rPr>
+          <w:rFonts w:eastAsia="" w:ascii="Times New Roman" w:hAnsi="Times New Roman" w:eastAsiaTheme="minorEastAsia"/>
+          <w:sz w:val="28"/>
+          <w:szCs w:val="28"/>
+          <w:lang w:eastAsia="ru-RU"/>
+        </w:rPr>
+        <w:t>Завдання 2. Оцінка роботи перемагнічування Аn за один цикл.</w:t>
       </w:r>
     </w:p>
     <w:p>
@@ -5352,7 +7177,25 @@
           <w:szCs w:val="28"/>
           <w:lang w:eastAsia="ru-RU"/>
         </w:rPr>
-        <w:t>Завдання 2. Оцінка роботи перемагнічування Аn за один цикл.</w:t>
+        <w:t>2.1. Отримав максимальну петлю гістерезису</w:t>
+      </w:r>
+      <w:r>
+        <w:rPr>
+          <w:rFonts w:eastAsia="" w:ascii="Times New Roman" w:hAnsi="Times New Roman" w:eastAsiaTheme="minorEastAsia"/>
+          <w:sz w:val="28"/>
+          <w:szCs w:val="28"/>
+          <w:lang w:val="ru-RU" w:eastAsia="ru-RU"/>
+        </w:rPr>
+        <w:t>,</w:t>
+      </w:r>
+      <w:r>
+        <w:rPr>
+          <w:rFonts w:eastAsia="" w:ascii="Times New Roman" w:hAnsi="Times New Roman" w:eastAsiaTheme="minorEastAsia"/>
+          <w:sz w:val="28"/>
+          <w:szCs w:val="28"/>
+          <w:lang w:eastAsia="ru-RU"/>
+        </w:rPr>
+        <w:t xml:space="preserve"> увімкнув міліметрівку.</w:t>
       </w:r>
     </w:p>
     <w:p>
@@ -5373,7 +7216,7 @@
           <w:szCs w:val="28"/>
           <w:lang w:eastAsia="ru-RU"/>
         </w:rPr>
-        <w:t>2.1. Отримав максимальну петлю гістерезису</w:t>
+        <w:t xml:space="preserve">2.2. Зберіг картинку у форматі </w:t>
       </w:r>
       <w:r>
         <w:rPr>
@@ -5382,16 +7225,51 @@
           <w:szCs w:val="28"/>
           <w:lang w:val="ru-RU" w:eastAsia="ru-RU"/>
         </w:rPr>
-        <w:t>,</w:t>
+        <w:t>.</w:t>
       </w:r>
       <w:r>
         <w:rPr>
           <w:rFonts w:eastAsia="" w:ascii="Times New Roman" w:hAnsi="Times New Roman" w:eastAsiaTheme="minorEastAsia"/>
           <w:sz w:val="28"/>
           <w:szCs w:val="28"/>
-          <w:lang w:eastAsia="ru-RU"/>
-        </w:rPr>
-        <w:t xml:space="preserve"> увімкнув міліметрівку.</w:t>
+          <w:lang w:val="en-US" w:eastAsia="ru-RU"/>
+        </w:rPr>
+        <w:t>jpeg</w:t>
+      </w:r>
+      <w:r>
+        <w:rPr>
+          <w:rFonts w:eastAsia="" w:ascii="Times New Roman" w:hAnsi="Times New Roman" w:eastAsiaTheme="minorEastAsia"/>
+          <w:sz w:val="28"/>
+          <w:szCs w:val="28"/>
+          <w:lang w:eastAsia="ru-RU"/>
+        </w:rPr>
+        <w:t xml:space="preserve"> та обчислив площу:</w:t>
+      </w:r>
+    </w:p>
+    <w:p>
+      <w:pPr>
+        <w:pStyle w:val="Normal"/>
+        <w:spacing w:lineRule="auto" w:line="288" w:before="0" w:after="0"/>
+        <w:rPr>
+          <w:sz w:val="28"/>
+          <w:szCs w:val="28"/>
+        </w:rPr>
+      </w:pPr>
+      <w:r>
+        <w:rPr>
+          <w:rFonts w:eastAsia="" w:ascii="Times New Roman" w:hAnsi="Times New Roman" w:eastAsiaTheme="minorEastAsia"/>
+          <w:sz w:val="28"/>
+          <w:szCs w:val="28"/>
+          <w:lang w:eastAsia="ru-RU"/>
+        </w:rPr>
+        <w:t xml:space="preserve">Sn = </w:t>
+      </w:r>
+      <w:r>
+        <w:rPr>
+          <w:sz w:val="28"/>
+          <w:szCs w:val="28"/>
+        </w:rPr>
+        <w:t>5.75 кв. под.</w:t>
       </w:r>
     </w:p>
     <w:p>
@@ -5402,95 +7280,16 @@
           <w:rFonts w:ascii="Times New Roman" w:hAnsi="Times New Roman" w:eastAsia="" w:eastAsiaTheme="minorEastAsia"/>
           <w:sz w:val="28"/>
           <w:szCs w:val="28"/>
-          <w:lang w:eastAsia="ru-RU"/>
-        </w:rPr>
-      </w:pPr>
-      <w:r>
-        <w:rPr>
-          <w:rFonts w:eastAsia="" w:ascii="Times New Roman" w:hAnsi="Times New Roman" w:eastAsiaTheme="minorEastAsia"/>
-          <w:sz w:val="28"/>
-          <w:szCs w:val="28"/>
-          <w:lang w:eastAsia="ru-RU"/>
-        </w:rPr>
-        <w:t xml:space="preserve">2.2. Зберіг картинку у форматі </w:t>
-      </w:r>
-      <w:r>
-        <w:rPr>
-          <w:rFonts w:eastAsia="" w:ascii="Times New Roman" w:hAnsi="Times New Roman" w:eastAsiaTheme="minorEastAsia"/>
-          <w:sz w:val="28"/>
-          <w:szCs w:val="28"/>
-          <w:lang w:val="ru-RU" w:eastAsia="ru-RU"/>
-        </w:rPr>
-        <w:t>.</w:t>
-      </w:r>
-      <w:r>
-        <w:rPr>
-          <w:rFonts w:eastAsia="" w:ascii="Times New Roman" w:hAnsi="Times New Roman" w:eastAsiaTheme="minorEastAsia"/>
-          <w:sz w:val="28"/>
-          <w:szCs w:val="28"/>
           <w:lang w:val="en-US" w:eastAsia="ru-RU"/>
         </w:rPr>
-        <w:t>jpeg</w:t>
-      </w:r>
-      <w:r>
-        <w:rPr>
-          <w:rFonts w:eastAsia="" w:ascii="Times New Roman" w:hAnsi="Times New Roman" w:eastAsiaTheme="minorEastAsia"/>
-          <w:sz w:val="28"/>
-          <w:szCs w:val="28"/>
-          <w:lang w:eastAsia="ru-RU"/>
-        </w:rPr>
-        <w:t xml:space="preserve"> та обчислив площу:</w:t>
-      </w:r>
-    </w:p>
-    <w:p>
-      <w:pPr>
-        <w:pStyle w:val="Normal"/>
-        <w:spacing w:lineRule="auto" w:line="288" w:before="0" w:after="0"/>
-        <w:rPr>
-          <w:sz w:val="28"/>
-          <w:szCs w:val="28"/>
-        </w:rPr>
-      </w:pPr>
-      <w:r>
-        <w:rPr>
-          <w:rFonts w:eastAsia="" w:ascii="Times New Roman" w:hAnsi="Times New Roman" w:eastAsiaTheme="minorEastAsia"/>
-          <w:sz w:val="28"/>
-          <w:szCs w:val="28"/>
-          <w:lang w:eastAsia="ru-RU"/>
-        </w:rPr>
-        <w:t xml:space="preserve">Sn = </w:t>
-      </w:r>
-      <w:r>
-        <w:rPr>
-          <w:sz w:val="28"/>
-          <w:szCs w:val="28"/>
-        </w:rPr>
-        <w:t>5.75 кв. под.</w:t>
-      </w:r>
-    </w:p>
-    <w:p>
-      <w:pPr>
-        <w:pStyle w:val="Normal"/>
-        <w:spacing w:lineRule="auto" w:line="288" w:before="0" w:after="0"/>
-        <w:rPr>
-          <w:rFonts w:ascii="Times New Roman" w:hAnsi="Times New Roman" w:eastAsia="" w:eastAsiaTheme="minorEastAsia"/>
-          <w:sz w:val="28"/>
-          <w:szCs w:val="28"/>
-          <w:lang w:val="en-US" w:eastAsia="ru-RU"/>
-        </w:rPr>
-      </w:pPr>
-      <w:r>
-        <w:rPr>
-          <w:rFonts w:eastAsia="" w:ascii="Times New Roman" w:hAnsi="Times New Roman" w:eastAsiaTheme="minorEastAsia"/>
-          <w:sz w:val="28"/>
-          <w:szCs w:val="28"/>
-          <w:lang w:val="en-US" w:eastAsia="ru-RU"/>
-        </w:rPr>
+      </w:pPr>
+      <w:r>
+        <w:rPr/>
         <w:drawing>
           <wp:inline distT="0" distB="0" distL="0" distR="0">
             <wp:extent cx="4328160" cy="3245485"/>
             <wp:effectExtent l="0" t="0" r="0" b="0"/>
-            <wp:docPr id="3" name="Рисунок 4"/>
+            <wp:docPr id="6" name="Рисунок 4"/>
             <wp:cNvGraphicFramePr>
               <a:graphicFrameLocks xmlns:a="http://schemas.openxmlformats.org/drawingml/2006/main" noChangeAspect="1"/>
             </wp:cNvGraphicFramePr>
@@ -5498,13 +7297,13 @@
               <a:graphicData uri="http://schemas.openxmlformats.org/drawingml/2006/picture">
                 <pic:pic xmlns:pic="http://schemas.openxmlformats.org/drawingml/2006/picture">
                   <pic:nvPicPr>
-                    <pic:cNvPr id="3" name="Рисунок 4"/>
+                    <pic:cNvPr id="6" name="Рисунок 4"/>
                     <pic:cNvPicPr>
                       <a:picLocks noChangeAspect="1" noChangeArrowheads="1"/>
                     </pic:cNvPicPr>
                   </pic:nvPicPr>
                   <pic:blipFill>
-                    <a:blip r:embed="rId4"/>
+                    <a:blip r:embed="rId7"/>
                     <a:stretch>
                       <a:fillRect/>
                     </a:stretch>
@@ -5560,12 +7359,32 @@
       </w:pPr>
       <w:r>
         <w:rPr>
+          <w:rFonts w:eastAsia="" w:ascii="Times New Roman" w:hAnsi="Times New Roman" w:eastAsiaTheme="minorEastAsia"/>
+          <w:sz w:val="28"/>
+          <w:szCs w:val="28"/>
+          <w:lang w:eastAsia="ru-RU"/>
+        </w:rPr>
+        <w:t>цикл:</w:t>
+      </w:r>
+    </w:p>
+    <w:p>
+      <w:pPr>
+        <w:pStyle w:val="Normal"/>
+        <w:spacing w:lineRule="auto" w:line="288" w:before="0" w:after="0"/>
+        <w:rPr>
+          <w:rFonts w:ascii="Times New Roman" w:hAnsi="Times New Roman" w:eastAsia="" w:eastAsiaTheme="minorEastAsia"/>
+          <w:sz w:val="28"/>
+          <w:szCs w:val="28"/>
+          <w:lang w:eastAsia="ru-RU"/>
+        </w:rPr>
+      </w:pPr>
+      <w:r>
+        <w:rPr>
           <w:rFonts w:eastAsia="" w:eastAsiaTheme="minorEastAsia" w:ascii="Times New Roman" w:hAnsi="Times New Roman"/>
           <w:sz w:val="28"/>
           <w:szCs w:val="28"/>
           <w:lang w:eastAsia="ru-RU"/>
         </w:rPr>
-        <w:t>цикл:</w:t>
       </w:r>
     </w:p>
     <w:p>
@@ -5581,6 +7400,27 @@
       </w:pPr>
       <w:r>
         <w:rPr>
+          <w:rFonts w:eastAsia="" w:ascii="Times New Roman" w:hAnsi="Times New Roman" w:eastAsiaTheme="minorEastAsia"/>
+          <w:sz w:val="28"/>
+          <w:szCs w:val="28"/>
+          <w:lang w:eastAsia="ru-RU"/>
+        </w:rPr>
+        <w:t>An = (N1 * R2 * b1 * b2 * C / (2 * pi * rт * R1 * N2 * S2)) * Sn = (200 * 24000 * 1,5354 * 0,6865 * 0,000000022 / (2 * 3,14 * 0,012375 * 400 * 75 * 0,00004375)) * 5,75 = 6,275 (Дж)</w:t>
+      </w:r>
+    </w:p>
+    <w:p>
+      <w:pPr>
+        <w:pStyle w:val="Normal"/>
+        <w:spacing w:lineRule="auto" w:line="288" w:before="0" w:after="0"/>
+        <w:rPr>
+          <w:rFonts w:ascii="Times New Roman" w:hAnsi="Times New Roman" w:eastAsia="" w:eastAsiaTheme="minorEastAsia"/>
+          <w:sz w:val="28"/>
+          <w:szCs w:val="28"/>
+          <w:lang w:eastAsia="ru-RU"/>
+        </w:rPr>
+      </w:pPr>
+      <w:r>
+        <w:rPr>
           <w:rFonts w:eastAsia="" w:eastAsiaTheme="minorEastAsia" w:ascii="Times New Roman" w:hAnsi="Times New Roman"/>
           <w:sz w:val="28"/>
           <w:szCs w:val="28"/>
@@ -5601,12 +7441,12 @@
       </w:pPr>
       <w:r>
         <w:rPr>
-          <w:rFonts w:eastAsia="" w:eastAsiaTheme="minorEastAsia" w:ascii="Times New Roman" w:hAnsi="Times New Roman"/>
-          <w:sz w:val="28"/>
-          <w:szCs w:val="28"/>
-          <w:lang w:eastAsia="ru-RU"/>
-        </w:rPr>
-        <w:t>An = (N1 * R2 * b1 * b2 * C / (2 * pi * rт * R1 * N2 * S2)) * Sn = (200 * 24000 * 1,5354 * 0,6865 * 0,000000022 / (2 * 3,14 * 0,012375 * 400 * 75 * 0,00004375)) * 5,75 = 6,275 (Дж)</w:t>
+          <w:rFonts w:eastAsia="" w:ascii="Times New Roman" w:hAnsi="Times New Roman" w:eastAsiaTheme="minorEastAsia"/>
+          <w:sz w:val="28"/>
+          <w:szCs w:val="28"/>
+          <w:lang w:eastAsia="ru-RU"/>
+        </w:rPr>
+        <w:t>Завдання 3. Визначення коерцитивної сили.</w:t>
       </w:r>
     </w:p>
     <w:p>
@@ -5622,11 +7462,12 @@
       </w:pPr>
       <w:r>
         <w:rPr>
-          <w:rFonts w:eastAsia="" w:eastAsiaTheme="minorEastAsia" w:ascii="Times New Roman" w:hAnsi="Times New Roman"/>
-          <w:sz w:val="28"/>
-          <w:szCs w:val="28"/>
-          <w:lang w:eastAsia="ru-RU"/>
-        </w:rPr>
+          <w:rFonts w:eastAsia="" w:ascii="Times New Roman" w:hAnsi="Times New Roman" w:eastAsiaTheme="minorEastAsia"/>
+          <w:sz w:val="28"/>
+          <w:szCs w:val="28"/>
+          <w:lang w:eastAsia="ru-RU"/>
+        </w:rPr>
+        <w:t>3.1. За максимальною петлею гістерезису визначити координати ± хс, що</w:t>
       </w:r>
     </w:p>
     <w:p>
@@ -5647,7 +7488,7 @@
           <w:szCs w:val="28"/>
           <w:lang w:eastAsia="ru-RU"/>
         </w:rPr>
-        <w:t>Завдання 3. Визначення коерцитивної сили.</w:t>
+        <w:t>відповідають коерцитивній силі ± Нс.</w:t>
       </w:r>
     </w:p>
     <w:p>
@@ -5668,7 +7509,60 @@
           <w:szCs w:val="28"/>
           <w:lang w:eastAsia="ru-RU"/>
         </w:rPr>
-        <w:t>3.1. За максимальною петлею гістерезису визначити координати ± хс, що</w:t>
+        <w:t>1.2. За формулою (2.11) обчислити значення Нс:</w:t>
+      </w:r>
+    </w:p>
+    <w:p>
+      <w:pPr>
+        <w:pStyle w:val="Normal"/>
+        <w:spacing w:lineRule="auto" w:line="288" w:before="0" w:after="0"/>
+        <w:rPr>
+          <w:sz w:val="28"/>
+          <w:szCs w:val="28"/>
+        </w:rPr>
+      </w:pPr>
+      <w:r>
+        <w:rPr>
+          <w:rFonts w:eastAsia="" w:ascii="Times New Roman" w:hAnsi="Times New Roman" w:eastAsiaTheme="minorEastAsia"/>
+          <w:sz w:val="28"/>
+          <w:szCs w:val="28"/>
+          <w:lang w:eastAsia="ru-RU"/>
+        </w:rPr>
+        <w:t>Hc = α * b1 * x =</w:t>
+      </w:r>
+      <w:r>
+        <w:rPr>
+          <w:sz w:val="28"/>
+          <w:szCs w:val="28"/>
+        </w:rPr>
+        <w:t xml:space="preserve">6.43376⋅1.5354⋅0.976=9.641 </w:t>
+      </w:r>
+      <w:r>
+        <w:rPr>
+          <w:rFonts w:eastAsia="" w:ascii="Times New Roman" w:hAnsi="Times New Roman" w:eastAsiaTheme="minorEastAsia"/>
+          <w:sz w:val="28"/>
+          <w:szCs w:val="28"/>
+          <w:lang w:eastAsia="ru-RU"/>
+        </w:rPr>
+        <w:t>А</w:t>
+      </w:r>
+      <w:r>
+        <w:rPr>
+          <w:rFonts w:eastAsia="" w:ascii="Times New Roman" w:hAnsi="Times New Roman" w:eastAsiaTheme="minorEastAsia"/>
+          <w:sz w:val="28"/>
+          <w:szCs w:val="28"/>
+          <w:lang w:val="ru-RU" w:eastAsia="ru-RU"/>
+        </w:rPr>
+        <w:t>/</w:t>
+      </w:r>
+      <w:r>
+        <w:rPr>
+          <w:rFonts w:eastAsia="" w:ascii="Times New Roman" w:hAnsi="Times New Roman" w:eastAsiaTheme="minorEastAsia"/>
+          <w:sz w:val="28"/>
+          <w:szCs w:val="28"/>
+          <w:lang w:eastAsia="ru-RU"/>
+        </w:rPr>
+        <w:t>м</w:t>
       </w:r>
     </w:p>
     <w:p>
@@ -5689,7 +7583,7 @@
           <w:szCs w:val="28"/>
           <w:lang w:eastAsia="ru-RU"/>
         </w:rPr>
-        <w:t>відповідають коерцитивній силі ± Нс.</w:t>
+        <w:t>1.3. Визначити групу феромагнетика (м'який або жорсткий):</w:t>
       </w:r>
     </w:p>
     <w:p>
@@ -5710,116 +7604,21 @@
           <w:szCs w:val="28"/>
           <w:lang w:eastAsia="ru-RU"/>
         </w:rPr>
-        <w:t>1.2. За формулою (2.11) обчислити значення Нс:</w:t>
-      </w:r>
-    </w:p>
-    <w:p>
-      <w:pPr>
-        <w:pStyle w:val="Normal"/>
-        <w:spacing w:lineRule="auto" w:line="288" w:before="0" w:after="0"/>
-        <w:rPr>
-          <w:sz w:val="28"/>
-          <w:szCs w:val="28"/>
-        </w:rPr>
-      </w:pPr>
+        <w:t xml:space="preserve">Оскільки Hc​=9.641 А/м, що значно менше за 100 А/м, даний феромагнетик належить до </w:t>
+      </w:r>
       <w:r>
         <w:rPr>
           <w:rFonts w:eastAsia="" w:ascii="Times New Roman" w:hAnsi="Times New Roman" w:eastAsiaTheme="minorEastAsia"/>
-          <w:sz w:val="28"/>
-          <w:szCs w:val="28"/>
-          <w:lang w:eastAsia="ru-RU"/>
-        </w:rPr>
-        <w:t>Hc = α * b1 * x =</w:t>
-      </w:r>
-      <w:r>
-        <w:rPr>
-          <w:sz w:val="28"/>
-          <w:szCs w:val="28"/>
-        </w:rPr>
-        <w:t xml:space="preserve">6.43376⋅1.5354⋅0.976=9.641 </w:t>
+          <w:b/>
+          <w:sz w:val="28"/>
+          <w:szCs w:val="28"/>
+          <w:lang w:eastAsia="ru-RU"/>
+        </w:rPr>
+        <w:t>м'яких</w:t>
       </w:r>
       <w:r>
         <w:rPr>
           <w:rFonts w:eastAsia="" w:ascii="Times New Roman" w:hAnsi="Times New Roman" w:eastAsiaTheme="minorEastAsia"/>
-          <w:sz w:val="28"/>
-          <w:szCs w:val="28"/>
-          <w:lang w:eastAsia="ru-RU"/>
-        </w:rPr>
-        <w:t>А</w:t>
-      </w:r>
-      <w:r>
-        <w:rPr>
-          <w:rFonts w:eastAsia="" w:ascii="Times New Roman" w:hAnsi="Times New Roman" w:eastAsiaTheme="minorEastAsia"/>
-          <w:sz w:val="28"/>
-          <w:szCs w:val="28"/>
-          <w:lang w:val="ru-RU" w:eastAsia="ru-RU"/>
-        </w:rPr>
-        <w:t>/</w:t>
-      </w:r>
-      <w:r>
-        <w:rPr>
-          <w:rFonts w:eastAsia="" w:ascii="Times New Roman" w:hAnsi="Times New Roman" w:eastAsiaTheme="minorEastAsia"/>
-          <w:sz w:val="28"/>
-          <w:szCs w:val="28"/>
-          <w:lang w:eastAsia="ru-RU"/>
-        </w:rPr>
-        <w:t>м</w:t>
-      </w:r>
-    </w:p>
-    <w:p>
-      <w:pPr>
-        <w:pStyle w:val="Normal"/>
-        <w:spacing w:lineRule="auto" w:line="288" w:before="0" w:after="0"/>
-        <w:rPr>
-          <w:rFonts w:ascii="Times New Roman" w:hAnsi="Times New Roman" w:eastAsia="" w:eastAsiaTheme="minorEastAsia"/>
-          <w:sz w:val="28"/>
-          <w:szCs w:val="28"/>
-          <w:lang w:eastAsia="ru-RU"/>
-        </w:rPr>
-      </w:pPr>
-      <w:r>
-        <w:rPr>
-          <w:rFonts w:eastAsia="" w:ascii="Times New Roman" w:hAnsi="Times New Roman" w:eastAsiaTheme="minorEastAsia"/>
-          <w:sz w:val="28"/>
-          <w:szCs w:val="28"/>
-          <w:lang w:eastAsia="ru-RU"/>
-        </w:rPr>
-        <w:t>1.3. Визначити групу феромагнетика (м'який або жорсткий):</w:t>
-      </w:r>
-    </w:p>
-    <w:p>
-      <w:pPr>
-        <w:pStyle w:val="Normal"/>
-        <w:spacing w:lineRule="auto" w:line="288" w:before="0" w:after="0"/>
-        <w:rPr>
-          <w:rFonts w:ascii="Times New Roman" w:hAnsi="Times New Roman" w:eastAsia="" w:eastAsiaTheme="minorEastAsia"/>
-          <w:sz w:val="28"/>
-          <w:szCs w:val="28"/>
-          <w:lang w:eastAsia="ru-RU"/>
-        </w:rPr>
-      </w:pPr>
-      <w:r>
-        <w:rPr>
-          <w:rFonts w:eastAsia="" w:eastAsiaTheme="minorEastAsia" w:ascii="Times New Roman" w:hAnsi="Times New Roman"/>
-          <w:sz w:val="28"/>
-          <w:szCs w:val="28"/>
-          <w:lang w:eastAsia="ru-RU"/>
-        </w:rPr>
-        <w:t xml:space="preserve">Оскільки Hc​=9.641 А/м, що значно менше за 100 А/м, даний феромагнетик належить до </w:t>
-      </w:r>
-      <w:r>
-        <w:rPr>
-          <w:rFonts w:eastAsia="" w:eastAsiaTheme="minorEastAsia" w:ascii="Times New Roman" w:hAnsi="Times New Roman"/>
-          <w:b/>
-          <w:sz w:val="28"/>
-          <w:szCs w:val="28"/>
-          <w:lang w:eastAsia="ru-RU"/>
-        </w:rPr>
-        <w:t>м'яких</w:t>
-      </w:r>
-      <w:r>
-        <w:rPr>
-          <w:rFonts w:eastAsia="" w:eastAsiaTheme="minorEastAsia" w:ascii="Times New Roman" w:hAnsi="Times New Roman"/>
           <w:sz w:val="28"/>
           <w:szCs w:val="28"/>
           <w:lang w:eastAsia="ru-RU"/>
@@ -5934,7 +7733,7 @@
         <w:pStyle w:val="BodyText"/>
         <w:numPr>
           <w:ilvl w:val="0"/>
-          <w:numId w:val="2"/>
+          <w:numId w:val="1"/>
         </w:numPr>
         <w:tabs>
           <w:tab w:val="clear" w:pos="720"/>
@@ -5969,7 +7768,7 @@
         <w:pStyle w:val="BodyText"/>
         <w:numPr>
           <w:ilvl w:val="0"/>
-          <w:numId w:val="2"/>
+          <w:numId w:val="1"/>
         </w:numPr>
         <w:tabs>
           <w:tab w:val="clear" w:pos="720"/>
@@ -6027,7 +7826,7 @@
         <w:pStyle w:val="BodyText"/>
         <w:numPr>
           <w:ilvl w:val="0"/>
-          <w:numId w:val="2"/>
+          <w:numId w:val="1"/>
         </w:numPr>
         <w:tabs>
           <w:tab w:val="clear" w:pos="720"/>
@@ -6085,7 +7884,7 @@
         <w:pStyle w:val="BodyText"/>
         <w:numPr>
           <w:ilvl w:val="0"/>
-          <w:numId w:val="2"/>
+          <w:numId w:val="1"/>
         </w:numPr>
         <w:tabs>
           <w:tab w:val="clear" w:pos="720"/>
@@ -6143,7 +7942,7 @@
         <w:pStyle w:val="BodyText"/>
         <w:numPr>
           <w:ilvl w:val="0"/>
-          <w:numId w:val="2"/>
+          <w:numId w:val="1"/>
         </w:numPr>
         <w:tabs>
           <w:tab w:val="clear" w:pos="720"/>
@@ -6330,35 +8129,35 @@
       <w:lvlJc w:val="start"/>
       <w:pPr>
         <w:tabs>
-          <w:tab w:val="num" w:pos="0"/>
+          <w:tab w:val="num" w:pos="709"/>
         </w:tabs>
-        <w:ind w:start="76" w:hanging="360"/>
+        <w:ind w:start="709" w:hanging="283"/>
       </w:pPr>
       <w:rPr/>
     </w:lvl>
     <w:lvl w:ilvl="1">
       <w:start w:val="1"/>
-      <w:numFmt w:val="lowerLetter"/>
+      <w:numFmt w:val="decimal"/>
       <w:lvlText w:val="%2."/>
       <w:lvlJc w:val="start"/>
       <w:pPr>
         <w:tabs>
-          <w:tab w:val="num" w:pos="0"/>
+          <w:tab w:val="num" w:pos="1418"/>
         </w:tabs>
-        <w:ind w:start="796" w:hanging="360"/>
+        <w:ind w:start="1418" w:hanging="283"/>
       </w:pPr>
       <w:rPr/>
     </w:lvl>
     <w:lvl w:ilvl="2">
       <w:start w:val="1"/>
-      <w:numFmt w:val="lowerRoman"/>
+      <w:numFmt w:val="decimal"/>
       <w:lvlText w:val="%3."/>
-      <w:lvlJc w:val="end"/>
+      <w:lvlJc w:val="start"/>
       <w:pPr>
         <w:tabs>
-          <w:tab w:val="num" w:pos="0"/>
+          <w:tab w:val="num" w:pos="2127"/>
         </w:tabs>
-        <w:ind w:start="1516" w:hanging="180"/>
+        <w:ind w:start="2127" w:hanging="283"/>
       </w:pPr>
       <w:rPr/>
     </w:lvl>
@@ -6369,35 +8168,35 @@
       <w:lvlJc w:val="start"/>
       <w:pPr>
         <w:tabs>
-          <w:tab w:val="num" w:pos="0"/>
+          <w:tab w:val="num" w:pos="2836"/>
         </w:tabs>
-        <w:ind w:start="2236" w:hanging="360"/>
+        <w:ind w:start="2836" w:hanging="283"/>
       </w:pPr>
       <w:rPr/>
     </w:lvl>
     <w:lvl w:ilvl="4">
       <w:start w:val="1"/>
-      <w:numFmt w:val="lowerLetter"/>
+      <w:numFmt w:val="decimal"/>
       <w:lvlText w:val="%5."/>
       <w:lvlJc w:val="start"/>
       <w:pPr>
         <w:tabs>
-          <w:tab w:val="num" w:pos="0"/>
+          <w:tab w:val="num" w:pos="3545"/>
         </w:tabs>
-        <w:ind w:start="2956" w:hanging="360"/>
+        <w:ind w:start="3545" w:hanging="283"/>
       </w:pPr>
       <w:rPr/>
     </w:lvl>
     <w:lvl w:ilvl="5">
       <w:start w:val="1"/>
-      <w:numFmt w:val="lowerRoman"/>
+      <w:numFmt w:val="decimal"/>
       <w:lvlText w:val="%6."/>
-      <w:lvlJc w:val="end"/>
+      <w:lvlJc w:val="start"/>
       <w:pPr>
         <w:tabs>
-          <w:tab w:val="num" w:pos="0"/>
+          <w:tab w:val="num" w:pos="4254"/>
         </w:tabs>
-        <w:ind w:start="3676" w:hanging="180"/>
+        <w:ind w:start="4254" w:hanging="283"/>
       </w:pPr>
       <w:rPr/>
     </w:lvl>
@@ -6408,125 +8207,6 @@
       <w:lvlJc w:val="start"/>
       <w:pPr>
         <w:tabs>
-          <w:tab w:val="num" w:pos="0"/>
-        </w:tabs>
-        <w:ind w:start="4396" w:hanging="360"/>
-      </w:pPr>
-      <w:rPr/>
-    </w:lvl>
-    <w:lvl w:ilvl="7">
-      <w:start w:val="1"/>
-      <w:numFmt w:val="lowerLetter"/>
-      <w:lvlText w:val="%8."/>
-      <w:lvlJc w:val="start"/>
-      <w:pPr>
-        <w:tabs>
-          <w:tab w:val="num" w:pos="0"/>
-        </w:tabs>
-        <w:ind w:start="5116" w:hanging="360"/>
-      </w:pPr>
-      <w:rPr/>
-    </w:lvl>
-    <w:lvl w:ilvl="8">
-      <w:start w:val="1"/>
-      <w:numFmt w:val="lowerRoman"/>
-      <w:lvlText w:val="%9."/>
-      <w:lvlJc w:val="end"/>
-      <w:pPr>
-        <w:tabs>
-          <w:tab w:val="num" w:pos="0"/>
-        </w:tabs>
-        <w:ind w:start="5836" w:hanging="180"/>
-      </w:pPr>
-      <w:rPr/>
-    </w:lvl>
-  </w:abstractNum>
-  <w:abstractNum w:abstractNumId="2">
-    <w:lvl w:ilvl="0">
-      <w:start w:val="1"/>
-      <w:numFmt w:val="decimal"/>
-      <w:lvlText w:val="%1."/>
-      <w:lvlJc w:val="start"/>
-      <w:pPr>
-        <w:tabs>
-          <w:tab w:val="num" w:pos="709"/>
-        </w:tabs>
-        <w:ind w:start="709" w:hanging="283"/>
-      </w:pPr>
-      <w:rPr/>
-    </w:lvl>
-    <w:lvl w:ilvl="1">
-      <w:start w:val="1"/>
-      <w:numFmt w:val="decimal"/>
-      <w:lvlText w:val="%2."/>
-      <w:lvlJc w:val="start"/>
-      <w:pPr>
-        <w:tabs>
-          <w:tab w:val="num" w:pos="1418"/>
-        </w:tabs>
-        <w:ind w:start="1418" w:hanging="283"/>
-      </w:pPr>
-      <w:rPr/>
-    </w:lvl>
-    <w:lvl w:ilvl="2">
-      <w:start w:val="1"/>
-      <w:numFmt w:val="decimal"/>
-      <w:lvlText w:val="%3."/>
-      <w:lvlJc w:val="start"/>
-      <w:pPr>
-        <w:tabs>
-          <w:tab w:val="num" w:pos="2127"/>
-        </w:tabs>
-        <w:ind w:start="2127" w:hanging="283"/>
-      </w:pPr>
-      <w:rPr/>
-    </w:lvl>
-    <w:lvl w:ilvl="3">
-      <w:start w:val="1"/>
-      <w:numFmt w:val="decimal"/>
-      <w:lvlText w:val="%4."/>
-      <w:lvlJc w:val="start"/>
-      <w:pPr>
-        <w:tabs>
-          <w:tab w:val="num" w:pos="2836"/>
-        </w:tabs>
-        <w:ind w:start="2836" w:hanging="283"/>
-      </w:pPr>
-      <w:rPr/>
-    </w:lvl>
-    <w:lvl w:ilvl="4">
-      <w:start w:val="1"/>
-      <w:numFmt w:val="decimal"/>
-      <w:lvlText w:val="%5."/>
-      <w:lvlJc w:val="start"/>
-      <w:pPr>
-        <w:tabs>
-          <w:tab w:val="num" w:pos="3545"/>
-        </w:tabs>
-        <w:ind w:start="3545" w:hanging="283"/>
-      </w:pPr>
-      <w:rPr/>
-    </w:lvl>
-    <w:lvl w:ilvl="5">
-      <w:start w:val="1"/>
-      <w:numFmt w:val="decimal"/>
-      <w:lvlText w:val="%6."/>
-      <w:lvlJc w:val="start"/>
-      <w:pPr>
-        <w:tabs>
-          <w:tab w:val="num" w:pos="4254"/>
-        </w:tabs>
-        <w:ind w:start="4254" w:hanging="283"/>
-      </w:pPr>
-      <w:rPr/>
-    </w:lvl>
-    <w:lvl w:ilvl="6">
-      <w:start w:val="1"/>
-      <w:numFmt w:val="decimal"/>
-      <w:lvlText w:val="%7."/>
-      <w:lvlJc w:val="start"/>
-      <w:pPr>
-        <w:tabs>
           <w:tab w:val="num" w:pos="4963"/>
         </w:tabs>
         <w:ind w:start="4963" w:hanging="283"/>
@@ -6560,7 +8240,7 @@
       <w:rPr/>
     </w:lvl>
   </w:abstractNum>
-  <w:abstractNum w:abstractNumId="3">
+  <w:abstractNum w:abstractNumId="2">
     <w:lvl w:ilvl="0">
       <w:start w:val="1"/>
       <w:numFmt w:val="none"/>
@@ -6684,9 +8364,6 @@
   </w:num>
   <w:num w:numId="2">
     <w:abstractNumId w:val="2"/>
-  </w:num>
-  <w:num w:numId="3">
-    <w:abstractNumId w:val="3"/>
   </w:num>
 </w:numbering>
 </file>
@@ -7098,12 +8775,12 @@
       <w:jc w:val="start"/>
     </w:pPr>
     <w:rPr>
-      <w:rFonts w:cs="Times New Roman" w:ascii="Calibri" w:hAnsi="Calibri" w:eastAsia="Calibri"/>
+      <w:rFonts w:ascii="Calibri" w:hAnsi="Calibri" w:eastAsia="Calibri" w:cs="Times New Roman"/>
       <w:color w:val="auto"/>
       <w:kern w:val="0"/>
       <w:sz w:val="22"/>
       <w:szCs w:val="22"/>
-      <w:lang w:eastAsia="zh-CN" w:val="uk-UA" w:bidi="ar-SA"/>
+      <w:lang w:val="uk-UA" w:eastAsia="zh-CN" w:bidi="ar-SA"/>
     </w:rPr>
   </w:style>
   <w:style w:type="paragraph" w:styleId="Heading1">

</xml_diff>